<commit_message>
se mejora la deduccion de complejos a travez de la integracion de reglas o pasos, si estas se cumplen, entra en determinado complejo, esto con el fin de mejorar la recopilacion de datos y manejo de informacion.
</commit_message>
<xml_diff>
--- a/voleyStats.docx
+++ b/voleyStats.docx
@@ -454,15 +454,7 @@
         </w:numPr>
       </w:pPr>
       <w:r>
-        <w:t xml:space="preserve">Procesos de </w:t>
-      </w:r>
-      <w:proofErr w:type="spellStart"/>
-      <w:r>
-        <w:t>scouting</w:t>
-      </w:r>
-      <w:proofErr w:type="spellEnd"/>
-      <w:r>
-        <w:t xml:space="preserve"> y desarrollo de jugadores</w:t>
+        <w:t>Procesos de scouting y desarrollo de jugadores</w:t>
       </w:r>
     </w:p>
     <w:p>
@@ -906,11 +898,9 @@
           <w:numId w:val="9"/>
         </w:numPr>
       </w:pPr>
-      <w:proofErr w:type="spellStart"/>
       <w:r>
         <w:t>Side-out</w:t>
       </w:r>
-      <w:proofErr w:type="spellEnd"/>
     </w:p>
     <w:p>
       <w:pPr>
@@ -930,11 +920,9 @@
           <w:numId w:val="9"/>
         </w:numPr>
       </w:pPr>
-      <w:proofErr w:type="spellStart"/>
       <w:r>
         <w:t>Freeball</w:t>
       </w:r>
-      <w:proofErr w:type="spellEnd"/>
     </w:p>
     <w:p>
       <w:pPr>
@@ -1001,17 +989,8 @@
           <w:b/>
           <w:bCs/>
         </w:rPr>
-        <w:t xml:space="preserve">K1 – </w:t>
-      </w:r>
-      <w:proofErr w:type="spellStart"/>
-      <w:r>
-        <w:rPr>
-          <w:b/>
-          <w:bCs/>
-        </w:rPr>
-        <w:t>Side-out</w:t>
-      </w:r>
-      <w:proofErr w:type="spellEnd"/>
+        <w:t>K1 – Side-out</w:t>
+      </w:r>
     </w:p>
     <w:p>
       <w:r>
@@ -1034,17 +1013,8 @@
           <w:b/>
           <w:bCs/>
         </w:rPr>
-        <w:t>K2 – Break-</w:t>
-      </w:r>
-      <w:proofErr w:type="spellStart"/>
-      <w:r>
-        <w:rPr>
-          <w:b/>
-          <w:bCs/>
-        </w:rPr>
-        <w:t>point</w:t>
-      </w:r>
-      <w:proofErr w:type="spellEnd"/>
+        <w:t>K2 – Break-point</w:t>
+      </w:r>
     </w:p>
     <w:p>
       <w:r>
@@ -1083,37 +1053,13 @@
           <w:b/>
           <w:bCs/>
         </w:rPr>
-        <w:t xml:space="preserve">K4 – </w:t>
-      </w:r>
-      <w:proofErr w:type="spellStart"/>
-      <w:r>
-        <w:rPr>
-          <w:b/>
-          <w:bCs/>
-        </w:rPr>
-        <w:t>Freeball</w:t>
-      </w:r>
-      <w:proofErr w:type="spellEnd"/>
-      <w:r>
-        <w:rPr>
-          <w:b/>
-          <w:bCs/>
-        </w:rPr>
-        <w:t xml:space="preserve"> / Transición especial</w:t>
+        <w:t>K4 – Freeball / Transición especial</w:t>
       </w:r>
     </w:p>
     <w:p>
       <w:r>
         <w:lastRenderedPageBreak/>
-        <w:t>Secuencia iniciada tras una pelota fácil (</w:t>
-      </w:r>
-      <w:proofErr w:type="spellStart"/>
-      <w:r>
-        <w:t>freeball</w:t>
-      </w:r>
-      <w:proofErr w:type="spellEnd"/>
-      <w:r>
-        <w:t>) o situación no forzada.</w:t>
+        <w:t>Secuencia iniciada tras una pelota fácil (freeball) o situación no forzada.</w:t>
       </w:r>
     </w:p>
     <w:p>
@@ -1792,15 +1738,7 @@
         </w:numPr>
       </w:pPr>
       <w:r>
-        <w:t>El rival se incorpora progresivamente (</w:t>
-      </w:r>
-      <w:proofErr w:type="spellStart"/>
-      <w:r>
-        <w:t>scouting</w:t>
-      </w:r>
-      <w:proofErr w:type="spellEnd"/>
-      <w:r>
-        <w:t>).</w:t>
+        <w:t>El rival se incorpora progresivamente (scouting).</w:t>
       </w:r>
     </w:p>
     <w:p>
@@ -2450,15 +2388,7 @@
         </w:numPr>
       </w:pPr>
       <w:r>
-        <w:t xml:space="preserve">escalar a </w:t>
-      </w:r>
-      <w:proofErr w:type="spellStart"/>
-      <w:r>
-        <w:t>scouting</w:t>
-      </w:r>
-      <w:proofErr w:type="spellEnd"/>
-      <w:r>
-        <w:t xml:space="preserve"> y comparación entre partidos.</w:t>
+        <w:t>escalar a scouting y comparación entre partidos.</w:t>
       </w:r>
     </w:p>
     <w:p/>
@@ -2548,7 +2478,7 @@
     <w:p>
       <w:r>
         <w:pict w14:anchorId="5744EEF7">
-          <v:rect id="_x0000_i1149" style="width:0;height:1.5pt" o:hralign="center" o:hrstd="t" o:hr="t" fillcolor="#a0a0a0" stroked="f"/>
+          <v:rect id="_x0000_i1041" style="width:0;height:1.5pt" o:hralign="center" o:hrstd="t" o:hr="t" fillcolor="#a0a0a0" stroked="f"/>
         </w:pict>
       </w:r>
     </w:p>
@@ -2706,7 +2636,7 @@
     <w:p>
       <w:r>
         <w:pict w14:anchorId="0A905705">
-          <v:rect id="_x0000_i1150" style="width:0;height:1.5pt" o:hralign="center" o:hrstd="t" o:hr="t" fillcolor="#a0a0a0" stroked="f"/>
+          <v:rect id="_x0000_i1042" style="width:0;height:1.5pt" o:hralign="center" o:hrstd="t" o:hr="t" fillcolor="#a0a0a0" stroked="f"/>
         </w:pict>
       </w:r>
     </w:p>
@@ -2829,7 +2759,7 @@
     <w:p>
       <w:r>
         <w:pict w14:anchorId="5E6713C3">
-          <v:rect id="_x0000_i1151" style="width:0;height:1.5pt" o:hralign="center" o:hrstd="t" o:hr="t" fillcolor="#a0a0a0" stroked="f"/>
+          <v:rect id="_x0000_i1043" style="width:0;height:1.5pt" o:hralign="center" o:hrstd="t" o:hr="t" fillcolor="#a0a0a0" stroked="f"/>
         </w:pict>
       </w:r>
     </w:p>
@@ -2925,7 +2855,7 @@
       <w:r>
         <w:lastRenderedPageBreak/>
         <w:pict w14:anchorId="336DFB7A">
-          <v:rect id="_x0000_i1152" style="width:0;height:1.5pt" o:hralign="center" o:hrstd="t" o:hr="t" fillcolor="#a0a0a0" stroked="f"/>
+          <v:rect id="_x0000_i1044" style="width:0;height:1.5pt" o:hralign="center" o:hrstd="t" o:hr="t" fillcolor="#a0a0a0" stroked="f"/>
         </w:pict>
       </w:r>
     </w:p>
@@ -3068,7 +2998,7 @@
     <w:p>
       <w:r>
         <w:pict w14:anchorId="1D5556C8">
-          <v:rect id="_x0000_i1153" style="width:0;height:1.5pt" o:hralign="center" o:hrstd="t" o:hr="t" fillcolor="#a0a0a0" stroked="f"/>
+          <v:rect id="_x0000_i1045" style="width:0;height:1.5pt" o:hralign="center" o:hrstd="t" o:hr="t" fillcolor="#a0a0a0" stroked="f"/>
         </w:pict>
       </w:r>
     </w:p>
@@ -3100,15 +3030,7 @@
         </w:numPr>
       </w:pPr>
       <w:r>
-        <w:t xml:space="preserve">tipo de ataque (fuerte, colocado, pipe, </w:t>
-      </w:r>
-      <w:proofErr w:type="spellStart"/>
-      <w:r>
-        <w:t>tip</w:t>
-      </w:r>
-      <w:proofErr w:type="spellEnd"/>
-      <w:r>
-        <w:t>)</w:t>
+        <w:t>tipo de ataque (fuerte, colocado, pipe, tip)</w:t>
       </w:r>
     </w:p>
     <w:p>
@@ -3162,7 +3084,7 @@
     <w:p>
       <w:r>
         <w:pict w14:anchorId="6DEEF9DD">
-          <v:rect id="_x0000_i1154" style="width:0;height:1.5pt" o:hralign="center" o:hrstd="t" o:hr="t" fillcolor="#a0a0a0" stroked="f"/>
+          <v:rect id="_x0000_i1046" style="width:0;height:1.5pt" o:hralign="center" o:hrstd="t" o:hr="t" fillcolor="#a0a0a0" stroked="f"/>
         </w:pict>
       </w:r>
     </w:p>
@@ -3216,15 +3138,7 @@
         </w:numPr>
       </w:pPr>
       <w:r>
-        <w:t xml:space="preserve">integrarse visualmente con el </w:t>
-      </w:r>
-      <w:proofErr w:type="spellStart"/>
-      <w:r>
-        <w:t>canvas</w:t>
-      </w:r>
-      <w:proofErr w:type="spellEnd"/>
-      <w:r>
-        <w:t>.</w:t>
+        <w:t>integrarse visualmente con el canvas.</w:t>
       </w:r>
     </w:p>
     <w:p>
@@ -3242,6 +3156,550 @@
         <w:t>, no que piense en el sistema.</w:t>
       </w:r>
     </w:p>
+    <w:p/>
+    <w:p/>
+    <w:p/>
+    <w:p/>
+    <w:p/>
+    <w:p>
+      <w:r>
+        <w:lastRenderedPageBreak/>
+        <w:t xml:space="preserve">Para distinguir los complejos se utilizarán las siguientes reglas: </w:t>
+      </w:r>
+      <w:r>
+        <w:rPr>
+          <w:b/>
+          <w:bCs/>
+        </w:rPr>
+        <w:t>Tabla De Reglas</w:t>
+      </w:r>
+    </w:p>
+    <w:p>
+      <w:r>
+        <w:t>La idea base es que el complejo se determine por:</w:t>
+      </w:r>
+    </w:p>
+    <w:p>
+      <w:pPr>
+        <w:numPr>
+          <w:ilvl w:val="0"/>
+          <w:numId w:val="37"/>
+        </w:numPr>
+      </w:pPr>
+      <w:r>
+        <w:t>tipo de acción actual</w:t>
+      </w:r>
+    </w:p>
+    <w:p>
+      <w:pPr>
+        <w:numPr>
+          <w:ilvl w:val="0"/>
+          <w:numId w:val="37"/>
+        </w:numPr>
+      </w:pPr>
+      <w:r>
+        <w:t>equipo que ejecuta la acción</w:t>
+      </w:r>
+    </w:p>
+    <w:p>
+      <w:pPr>
+        <w:numPr>
+          <w:ilvl w:val="0"/>
+          <w:numId w:val="37"/>
+        </w:numPr>
+      </w:pPr>
+      <w:r>
+        <w:t>equipo que ejecutó la acción anterior</w:t>
+      </w:r>
+    </w:p>
+    <w:p>
+      <w:pPr>
+        <w:numPr>
+          <w:ilvl w:val="0"/>
+          <w:numId w:val="37"/>
+        </w:numPr>
+      </w:pPr>
+      <w:r>
+        <w:t>fase del rally en la que estamos</w:t>
+      </w:r>
+    </w:p>
+    <w:p>
+      <w:pPr>
+        <w:numPr>
+          <w:ilvl w:val="0"/>
+          <w:numId w:val="37"/>
+        </w:numPr>
+      </w:pPr>
+      <w:r>
+        <w:t>si ya ocurrió el primer ataque de K1</w:t>
+      </w:r>
+    </w:p>
+    <w:p>
+      <w:pPr>
+        <w:numPr>
+          <w:ilvl w:val="0"/>
+          <w:numId w:val="37"/>
+        </w:numPr>
+      </w:pPr>
+      <w:r>
+        <w:t>si ya ocurrió el primer contraataque de K2</w:t>
+      </w:r>
+    </w:p>
+    <w:p>
+      <w:r>
+        <w:rPr>
+          <w:b/>
+          <w:bCs/>
+        </w:rPr>
+        <w:t>Regla 1: Saque</w:t>
+      </w:r>
+    </w:p>
+    <w:p>
+      <w:pPr>
+        <w:numPr>
+          <w:ilvl w:val="0"/>
+          <w:numId w:val="38"/>
+        </w:numPr>
+      </w:pPr>
+      <w:r>
+        <w:t>Si la acción actual es saque =&gt; complejo K0</w:t>
+      </w:r>
+    </w:p>
+    <w:p>
+      <w:r>
+        <w:rPr>
+          <w:b/>
+          <w:bCs/>
+        </w:rPr>
+        <w:t>Regla 2: Primera recepción al saque</w:t>
+      </w:r>
+    </w:p>
+    <w:p>
+      <w:pPr>
+        <w:numPr>
+          <w:ilvl w:val="0"/>
+          <w:numId w:val="39"/>
+        </w:numPr>
+      </w:pPr>
+      <w:r>
+        <w:t>Si la acción actual es recepcion</w:t>
+      </w:r>
+    </w:p>
+    <w:p>
+      <w:pPr>
+        <w:numPr>
+          <w:ilvl w:val="0"/>
+          <w:numId w:val="39"/>
+        </w:numPr>
+      </w:pPr>
+      <w:r>
+        <w:t>y la acción anterior fue saque</w:t>
+      </w:r>
+    </w:p>
+    <w:p>
+      <w:pPr>
+        <w:numPr>
+          <w:ilvl w:val="0"/>
+          <w:numId w:val="39"/>
+        </w:numPr>
+      </w:pPr>
+      <w:r>
+        <w:t>y el equipo actual es el rival del que sacó</w:t>
+      </w:r>
+    </w:p>
+    <w:p>
+      <w:pPr>
+        <w:numPr>
+          <w:ilvl w:val="0"/>
+          <w:numId w:val="39"/>
+        </w:numPr>
+      </w:pPr>
+      <w:r>
+        <w:t>entonces =&gt; K1</w:t>
+      </w:r>
+    </w:p>
+    <w:p>
+      <w:r>
+        <w:rPr>
+          <w:b/>
+          <w:bCs/>
+        </w:rPr>
+        <w:t>Regla 3: Armado posterior a recepción de saque</w:t>
+      </w:r>
+    </w:p>
+    <w:p>
+      <w:pPr>
+        <w:numPr>
+          <w:ilvl w:val="0"/>
+          <w:numId w:val="40"/>
+        </w:numPr>
+      </w:pPr>
+      <w:r>
+        <w:t>Si la acción actual es levantamiento</w:t>
+      </w:r>
+    </w:p>
+    <w:p>
+      <w:pPr>
+        <w:numPr>
+          <w:ilvl w:val="0"/>
+          <w:numId w:val="40"/>
+        </w:numPr>
+      </w:pPr>
+      <w:r>
+        <w:t>y el equipo actual está en fase de construcción tras recepción de saque</w:t>
+      </w:r>
+    </w:p>
+    <w:p>
+      <w:pPr>
+        <w:numPr>
+          <w:ilvl w:val="0"/>
+          <w:numId w:val="40"/>
+        </w:numPr>
+      </w:pPr>
+      <w:r>
+        <w:t>entonces =&gt; K1</w:t>
+      </w:r>
+    </w:p>
+    <w:p>
+      <w:r>
+        <w:rPr>
+          <w:b/>
+          <w:bCs/>
+        </w:rPr>
+        <w:t>Regla 4: Primer ataque del equipo receptor</w:t>
+      </w:r>
+    </w:p>
+    <w:p>
+      <w:pPr>
+        <w:numPr>
+          <w:ilvl w:val="0"/>
+          <w:numId w:val="41"/>
+        </w:numPr>
+      </w:pPr>
+      <w:r>
+        <w:t>Si la acción actual es ataque</w:t>
+      </w:r>
+    </w:p>
+    <w:p>
+      <w:pPr>
+        <w:numPr>
+          <w:ilvl w:val="0"/>
+          <w:numId w:val="41"/>
+        </w:numPr>
+      </w:pPr>
+      <w:r>
+        <w:t>y el equipo actual está completando la primera construcción tras recepción de saque</w:t>
+      </w:r>
+    </w:p>
+    <w:p>
+      <w:pPr>
+        <w:numPr>
+          <w:ilvl w:val="0"/>
+          <w:numId w:val="41"/>
+        </w:numPr>
+      </w:pPr>
+      <w:r>
+        <w:t>entonces =&gt; K1</w:t>
+      </w:r>
+    </w:p>
+    <w:p>
+      <w:pPr>
+        <w:numPr>
+          <w:ilvl w:val="0"/>
+          <w:numId w:val="41"/>
+        </w:numPr>
+      </w:pPr>
+      <w:r>
+        <w:t>al terminar ese ataque, el rally pasa a estado “primer ataque K1 realizado”</w:t>
+      </w:r>
+    </w:p>
+    <w:p>
+      <w:r>
+        <w:rPr>
+          <w:b/>
+          <w:bCs/>
+        </w:rPr>
+        <w:t>Regla 5: Primera defensa del equipo sacador</w:t>
+      </w:r>
+    </w:p>
+    <w:p>
+      <w:pPr>
+        <w:numPr>
+          <w:ilvl w:val="0"/>
+          <w:numId w:val="42"/>
+        </w:numPr>
+      </w:pPr>
+      <w:r>
+        <w:t>Si la acción actual es recepcion o defensa</w:t>
+      </w:r>
+    </w:p>
+    <w:p>
+      <w:pPr>
+        <w:numPr>
+          <w:ilvl w:val="0"/>
+          <w:numId w:val="42"/>
+        </w:numPr>
+      </w:pPr>
+      <w:r>
+        <w:t>y el último ataque fue del equipo receptor en K1</w:t>
+      </w:r>
+    </w:p>
+    <w:p>
+      <w:pPr>
+        <w:numPr>
+          <w:ilvl w:val="0"/>
+          <w:numId w:val="42"/>
+        </w:numPr>
+      </w:pPr>
+      <w:r>
+        <w:t>y el equipo actual es el que había sacado</w:t>
+      </w:r>
+    </w:p>
+    <w:p>
+      <w:pPr>
+        <w:numPr>
+          <w:ilvl w:val="0"/>
+          <w:numId w:val="42"/>
+        </w:numPr>
+      </w:pPr>
+      <w:r>
+        <w:t>entonces =&gt; K2</w:t>
+      </w:r>
+    </w:p>
+    <w:p>
+      <w:r>
+        <w:rPr>
+          <w:b/>
+          <w:bCs/>
+        </w:rPr>
+        <w:t>Regla 6: Armado del equipo sacador tras defender</w:t>
+      </w:r>
+    </w:p>
+    <w:p>
+      <w:pPr>
+        <w:numPr>
+          <w:ilvl w:val="0"/>
+          <w:numId w:val="43"/>
+        </w:numPr>
+      </w:pPr>
+      <w:r>
+        <w:t>Si la acción actual es levantamiento</w:t>
+      </w:r>
+    </w:p>
+    <w:p>
+      <w:pPr>
+        <w:numPr>
+          <w:ilvl w:val="0"/>
+          <w:numId w:val="43"/>
+        </w:numPr>
+      </w:pPr>
+      <w:r>
+        <w:lastRenderedPageBreak/>
+        <w:t>y el equipo actual ya defendió el ataque rival tras su saque</w:t>
+      </w:r>
+    </w:p>
+    <w:p>
+      <w:pPr>
+        <w:numPr>
+          <w:ilvl w:val="0"/>
+          <w:numId w:val="43"/>
+        </w:numPr>
+      </w:pPr>
+      <w:r>
+        <w:t>entonces =&gt; K2</w:t>
+      </w:r>
+    </w:p>
+    <w:p>
+      <w:r>
+        <w:rPr>
+          <w:b/>
+          <w:bCs/>
+        </w:rPr>
+        <w:t>Regla 7: Primer contraataque del equipo sacador</w:t>
+      </w:r>
+    </w:p>
+    <w:p>
+      <w:pPr>
+        <w:numPr>
+          <w:ilvl w:val="0"/>
+          <w:numId w:val="44"/>
+        </w:numPr>
+      </w:pPr>
+      <w:r>
+        <w:t>Si la acción actual es ataque</w:t>
+      </w:r>
+    </w:p>
+    <w:p>
+      <w:pPr>
+        <w:numPr>
+          <w:ilvl w:val="0"/>
+          <w:numId w:val="44"/>
+        </w:numPr>
+      </w:pPr>
+      <w:r>
+        <w:t>y el equipo actual está cerrando su primera transición tras defender</w:t>
+      </w:r>
+    </w:p>
+    <w:p>
+      <w:pPr>
+        <w:numPr>
+          <w:ilvl w:val="0"/>
+          <w:numId w:val="44"/>
+        </w:numPr>
+      </w:pPr>
+      <w:r>
+        <w:t>entonces =&gt; K2</w:t>
+      </w:r>
+    </w:p>
+    <w:p>
+      <w:pPr>
+        <w:numPr>
+          <w:ilvl w:val="0"/>
+          <w:numId w:val="44"/>
+        </w:numPr>
+      </w:pPr>
+      <w:r>
+        <w:t>al terminar ese ataque, el rally pasa a estado “primer contraataque K2 realizado”</w:t>
+      </w:r>
+    </w:p>
+    <w:p>
+      <w:r>
+        <w:rPr>
+          <w:b/>
+          <w:bCs/>
+        </w:rPr>
+        <w:t>Regla 8: Continuidad posterior</w:t>
+      </w:r>
+    </w:p>
+    <w:p>
+      <w:pPr>
+        <w:numPr>
+          <w:ilvl w:val="0"/>
+          <w:numId w:val="45"/>
+        </w:numPr>
+      </w:pPr>
+      <w:r>
+        <w:t>Si el rally sigue después del ataque de K2</w:t>
+      </w:r>
+    </w:p>
+    <w:p>
+      <w:pPr>
+        <w:numPr>
+          <w:ilvl w:val="0"/>
+          <w:numId w:val="45"/>
+        </w:numPr>
+      </w:pPr>
+      <w:r>
+        <w:t>cualquier nueva defensa, levantamiento o ataque de cualquiera de los dos equipos</w:t>
+      </w:r>
+    </w:p>
+    <w:p>
+      <w:pPr>
+        <w:numPr>
+          <w:ilvl w:val="0"/>
+          <w:numId w:val="45"/>
+        </w:numPr>
+      </w:pPr>
+      <w:r>
+        <w:t>pasa a ser K3</w:t>
+      </w:r>
+    </w:p>
+    <w:p>
+      <w:pPr>
+        <w:numPr>
+          <w:ilvl w:val="0"/>
+          <w:numId w:val="45"/>
+        </w:numPr>
+      </w:pPr>
+      <w:r>
+        <w:t>salvo que en el futuro haya evento claro de K4 o K5</w:t>
+      </w:r>
+    </w:p>
+    <w:p>
+      <w:r>
+        <w:rPr>
+          <w:b/>
+          <w:bCs/>
+        </w:rPr>
+        <w:t>Regla 9: Cobertura futura</w:t>
+      </w:r>
+    </w:p>
+    <w:p>
+      <w:pPr>
+        <w:numPr>
+          <w:ilvl w:val="0"/>
+          <w:numId w:val="46"/>
+        </w:numPr>
+      </w:pPr>
+      <w:r>
+        <w:t>Si en el futuro existe bloqueo</w:t>
+      </w:r>
+    </w:p>
+    <w:p>
+      <w:pPr>
+        <w:numPr>
+          <w:ilvl w:val="0"/>
+          <w:numId w:val="46"/>
+        </w:numPr>
+      </w:pPr>
+      <w:r>
+        <w:t>y el mismo equipo que atacó recupera la pelota después del bloqueo rival</w:t>
+      </w:r>
+    </w:p>
+    <w:p>
+      <w:pPr>
+        <w:numPr>
+          <w:ilvl w:val="0"/>
+          <w:numId w:val="46"/>
+        </w:numPr>
+      </w:pPr>
+      <w:r>
+        <w:t>entonces la nueva construcción pasa a K4</w:t>
+      </w:r>
+    </w:p>
+    <w:p>
+      <w:r>
+        <w:rPr>
+          <w:b/>
+          <w:bCs/>
+        </w:rPr>
+        <w:t>Regla 10: Free ball futura</w:t>
+      </w:r>
+    </w:p>
+    <w:p>
+      <w:pPr>
+        <w:numPr>
+          <w:ilvl w:val="0"/>
+          <w:numId w:val="47"/>
+        </w:numPr>
+      </w:pPr>
+      <w:r>
+        <w:t>Si en el futuro existe detección explícita de balón fácil</w:t>
+      </w:r>
+    </w:p>
+    <w:p>
+      <w:pPr>
+        <w:numPr>
+          <w:ilvl w:val="0"/>
+          <w:numId w:val="47"/>
+        </w:numPr>
+      </w:pPr>
+      <w:r>
+        <w:t>y un equipo recibe una pelota no agresiva/regalada</w:t>
+      </w:r>
+    </w:p>
+    <w:p>
+      <w:pPr>
+        <w:numPr>
+          <w:ilvl w:val="0"/>
+          <w:numId w:val="47"/>
+        </w:numPr>
+      </w:pPr>
+      <w:r>
+        <w:t>entonces la nueva construcción pasa a K5</w:t>
+      </w:r>
+    </w:p>
+    <w:p/>
     <w:p/>
     <w:p/>
     <w:p/>
@@ -4451,6 +4909,155 @@
     </w:lvl>
   </w:abstractNum>
   <w:abstractNum w:abstractNumId="8" w15:restartNumberingAfterBreak="0">
+    <w:nsid w:val="11B15B08"/>
+    <w:multiLevelType w:val="multilevel"/>
+    <w:tmpl w:val="F370A4C2"/>
+    <w:lvl w:ilvl="0">
+      <w:start w:val="1"/>
+      <w:numFmt w:val="bullet"/>
+      <w:lvlText w:val=""/>
+      <w:lvlJc w:val="left"/>
+      <w:pPr>
+        <w:tabs>
+          <w:tab w:val="num" w:pos="720"/>
+        </w:tabs>
+        <w:ind w:left="720" w:hanging="360"/>
+      </w:pPr>
+      <w:rPr>
+        <w:rFonts w:ascii="Symbol" w:hAnsi="Symbol" w:hint="default"/>
+        <w:sz w:val="20"/>
+      </w:rPr>
+    </w:lvl>
+    <w:lvl w:ilvl="1" w:tentative="1">
+      <w:start w:val="1"/>
+      <w:numFmt w:val="bullet"/>
+      <w:lvlText w:val=""/>
+      <w:lvlJc w:val="left"/>
+      <w:pPr>
+        <w:tabs>
+          <w:tab w:val="num" w:pos="1440"/>
+        </w:tabs>
+        <w:ind w:left="1440" w:hanging="360"/>
+      </w:pPr>
+      <w:rPr>
+        <w:rFonts w:ascii="Symbol" w:hAnsi="Symbol" w:hint="default"/>
+        <w:sz w:val="20"/>
+      </w:rPr>
+    </w:lvl>
+    <w:lvl w:ilvl="2" w:tentative="1">
+      <w:start w:val="1"/>
+      <w:numFmt w:val="bullet"/>
+      <w:lvlText w:val=""/>
+      <w:lvlJc w:val="left"/>
+      <w:pPr>
+        <w:tabs>
+          <w:tab w:val="num" w:pos="2160"/>
+        </w:tabs>
+        <w:ind w:left="2160" w:hanging="360"/>
+      </w:pPr>
+      <w:rPr>
+        <w:rFonts w:ascii="Symbol" w:hAnsi="Symbol" w:hint="default"/>
+        <w:sz w:val="20"/>
+      </w:rPr>
+    </w:lvl>
+    <w:lvl w:ilvl="3" w:tentative="1">
+      <w:start w:val="1"/>
+      <w:numFmt w:val="bullet"/>
+      <w:lvlText w:val=""/>
+      <w:lvlJc w:val="left"/>
+      <w:pPr>
+        <w:tabs>
+          <w:tab w:val="num" w:pos="2880"/>
+        </w:tabs>
+        <w:ind w:left="2880" w:hanging="360"/>
+      </w:pPr>
+      <w:rPr>
+        <w:rFonts w:ascii="Symbol" w:hAnsi="Symbol" w:hint="default"/>
+        <w:sz w:val="20"/>
+      </w:rPr>
+    </w:lvl>
+    <w:lvl w:ilvl="4" w:tentative="1">
+      <w:start w:val="1"/>
+      <w:numFmt w:val="bullet"/>
+      <w:lvlText w:val=""/>
+      <w:lvlJc w:val="left"/>
+      <w:pPr>
+        <w:tabs>
+          <w:tab w:val="num" w:pos="3600"/>
+        </w:tabs>
+        <w:ind w:left="3600" w:hanging="360"/>
+      </w:pPr>
+      <w:rPr>
+        <w:rFonts w:ascii="Symbol" w:hAnsi="Symbol" w:hint="default"/>
+        <w:sz w:val="20"/>
+      </w:rPr>
+    </w:lvl>
+    <w:lvl w:ilvl="5" w:tentative="1">
+      <w:start w:val="1"/>
+      <w:numFmt w:val="bullet"/>
+      <w:lvlText w:val=""/>
+      <w:lvlJc w:val="left"/>
+      <w:pPr>
+        <w:tabs>
+          <w:tab w:val="num" w:pos="4320"/>
+        </w:tabs>
+        <w:ind w:left="4320" w:hanging="360"/>
+      </w:pPr>
+      <w:rPr>
+        <w:rFonts w:ascii="Symbol" w:hAnsi="Symbol" w:hint="default"/>
+        <w:sz w:val="20"/>
+      </w:rPr>
+    </w:lvl>
+    <w:lvl w:ilvl="6" w:tentative="1">
+      <w:start w:val="1"/>
+      <w:numFmt w:val="bullet"/>
+      <w:lvlText w:val=""/>
+      <w:lvlJc w:val="left"/>
+      <w:pPr>
+        <w:tabs>
+          <w:tab w:val="num" w:pos="5040"/>
+        </w:tabs>
+        <w:ind w:left="5040" w:hanging="360"/>
+      </w:pPr>
+      <w:rPr>
+        <w:rFonts w:ascii="Symbol" w:hAnsi="Symbol" w:hint="default"/>
+        <w:sz w:val="20"/>
+      </w:rPr>
+    </w:lvl>
+    <w:lvl w:ilvl="7" w:tentative="1">
+      <w:start w:val="1"/>
+      <w:numFmt w:val="bullet"/>
+      <w:lvlText w:val=""/>
+      <w:lvlJc w:val="left"/>
+      <w:pPr>
+        <w:tabs>
+          <w:tab w:val="num" w:pos="5760"/>
+        </w:tabs>
+        <w:ind w:left="5760" w:hanging="360"/>
+      </w:pPr>
+      <w:rPr>
+        <w:rFonts w:ascii="Symbol" w:hAnsi="Symbol" w:hint="default"/>
+        <w:sz w:val="20"/>
+      </w:rPr>
+    </w:lvl>
+    <w:lvl w:ilvl="8" w:tentative="1">
+      <w:start w:val="1"/>
+      <w:numFmt w:val="bullet"/>
+      <w:lvlText w:val=""/>
+      <w:lvlJc w:val="left"/>
+      <w:pPr>
+        <w:tabs>
+          <w:tab w:val="num" w:pos="6480"/>
+        </w:tabs>
+        <w:ind w:left="6480" w:hanging="360"/>
+      </w:pPr>
+      <w:rPr>
+        <w:rFonts w:ascii="Symbol" w:hAnsi="Symbol" w:hint="default"/>
+        <w:sz w:val="20"/>
+      </w:rPr>
+    </w:lvl>
+  </w:abstractNum>
+  <w:abstractNum w:abstractNumId="9" w15:restartNumberingAfterBreak="0">
     <w:nsid w:val="149B2E77"/>
     <w:multiLevelType w:val="multilevel"/>
     <w:tmpl w:val="A0B482B0"/>
@@ -4599,7 +5206,7 @@
       </w:rPr>
     </w:lvl>
   </w:abstractNum>
-  <w:abstractNum w:abstractNumId="9" w15:restartNumberingAfterBreak="0">
+  <w:abstractNum w:abstractNumId="10" w15:restartNumberingAfterBreak="0">
     <w:nsid w:val="17E1429D"/>
     <w:multiLevelType w:val="multilevel"/>
     <w:tmpl w:val="7102D708"/>
@@ -4748,7 +5355,7 @@
       </w:rPr>
     </w:lvl>
   </w:abstractNum>
-  <w:abstractNum w:abstractNumId="10" w15:restartNumberingAfterBreak="0">
+  <w:abstractNum w:abstractNumId="11" w15:restartNumberingAfterBreak="0">
     <w:nsid w:val="18692820"/>
     <w:multiLevelType w:val="multilevel"/>
     <w:tmpl w:val="177EACA0"/>
@@ -4897,7 +5504,7 @@
       </w:rPr>
     </w:lvl>
   </w:abstractNum>
-  <w:abstractNum w:abstractNumId="11" w15:restartNumberingAfterBreak="0">
+  <w:abstractNum w:abstractNumId="12" w15:restartNumberingAfterBreak="0">
     <w:nsid w:val="18A652A8"/>
     <w:multiLevelType w:val="multilevel"/>
     <w:tmpl w:val="6A445314"/>
@@ -5046,7 +5653,7 @@
       </w:rPr>
     </w:lvl>
   </w:abstractNum>
-  <w:abstractNum w:abstractNumId="12" w15:restartNumberingAfterBreak="0">
+  <w:abstractNum w:abstractNumId="13" w15:restartNumberingAfterBreak="0">
     <w:nsid w:val="19AD4293"/>
     <w:multiLevelType w:val="multilevel"/>
     <w:tmpl w:val="6F0CB8CE"/>
@@ -5195,7 +5802,305 @@
       </w:rPr>
     </w:lvl>
   </w:abstractNum>
-  <w:abstractNum w:abstractNumId="13" w15:restartNumberingAfterBreak="0">
+  <w:abstractNum w:abstractNumId="14" w15:restartNumberingAfterBreak="0">
+    <w:nsid w:val="1A6C6130"/>
+    <w:multiLevelType w:val="multilevel"/>
+    <w:tmpl w:val="8D1278FA"/>
+    <w:lvl w:ilvl="0">
+      <w:start w:val="1"/>
+      <w:numFmt w:val="bullet"/>
+      <w:lvlText w:val=""/>
+      <w:lvlJc w:val="left"/>
+      <w:pPr>
+        <w:tabs>
+          <w:tab w:val="num" w:pos="720"/>
+        </w:tabs>
+        <w:ind w:left="720" w:hanging="360"/>
+      </w:pPr>
+      <w:rPr>
+        <w:rFonts w:ascii="Symbol" w:hAnsi="Symbol" w:hint="default"/>
+        <w:sz w:val="20"/>
+      </w:rPr>
+    </w:lvl>
+    <w:lvl w:ilvl="1" w:tentative="1">
+      <w:start w:val="1"/>
+      <w:numFmt w:val="bullet"/>
+      <w:lvlText w:val=""/>
+      <w:lvlJc w:val="left"/>
+      <w:pPr>
+        <w:tabs>
+          <w:tab w:val="num" w:pos="1440"/>
+        </w:tabs>
+        <w:ind w:left="1440" w:hanging="360"/>
+      </w:pPr>
+      <w:rPr>
+        <w:rFonts w:ascii="Symbol" w:hAnsi="Symbol" w:hint="default"/>
+        <w:sz w:val="20"/>
+      </w:rPr>
+    </w:lvl>
+    <w:lvl w:ilvl="2" w:tentative="1">
+      <w:start w:val="1"/>
+      <w:numFmt w:val="bullet"/>
+      <w:lvlText w:val=""/>
+      <w:lvlJc w:val="left"/>
+      <w:pPr>
+        <w:tabs>
+          <w:tab w:val="num" w:pos="2160"/>
+        </w:tabs>
+        <w:ind w:left="2160" w:hanging="360"/>
+      </w:pPr>
+      <w:rPr>
+        <w:rFonts w:ascii="Symbol" w:hAnsi="Symbol" w:hint="default"/>
+        <w:sz w:val="20"/>
+      </w:rPr>
+    </w:lvl>
+    <w:lvl w:ilvl="3" w:tentative="1">
+      <w:start w:val="1"/>
+      <w:numFmt w:val="bullet"/>
+      <w:lvlText w:val=""/>
+      <w:lvlJc w:val="left"/>
+      <w:pPr>
+        <w:tabs>
+          <w:tab w:val="num" w:pos="2880"/>
+        </w:tabs>
+        <w:ind w:left="2880" w:hanging="360"/>
+      </w:pPr>
+      <w:rPr>
+        <w:rFonts w:ascii="Symbol" w:hAnsi="Symbol" w:hint="default"/>
+        <w:sz w:val="20"/>
+      </w:rPr>
+    </w:lvl>
+    <w:lvl w:ilvl="4" w:tentative="1">
+      <w:start w:val="1"/>
+      <w:numFmt w:val="bullet"/>
+      <w:lvlText w:val=""/>
+      <w:lvlJc w:val="left"/>
+      <w:pPr>
+        <w:tabs>
+          <w:tab w:val="num" w:pos="3600"/>
+        </w:tabs>
+        <w:ind w:left="3600" w:hanging="360"/>
+      </w:pPr>
+      <w:rPr>
+        <w:rFonts w:ascii="Symbol" w:hAnsi="Symbol" w:hint="default"/>
+        <w:sz w:val="20"/>
+      </w:rPr>
+    </w:lvl>
+    <w:lvl w:ilvl="5" w:tentative="1">
+      <w:start w:val="1"/>
+      <w:numFmt w:val="bullet"/>
+      <w:lvlText w:val=""/>
+      <w:lvlJc w:val="left"/>
+      <w:pPr>
+        <w:tabs>
+          <w:tab w:val="num" w:pos="4320"/>
+        </w:tabs>
+        <w:ind w:left="4320" w:hanging="360"/>
+      </w:pPr>
+      <w:rPr>
+        <w:rFonts w:ascii="Symbol" w:hAnsi="Symbol" w:hint="default"/>
+        <w:sz w:val="20"/>
+      </w:rPr>
+    </w:lvl>
+    <w:lvl w:ilvl="6" w:tentative="1">
+      <w:start w:val="1"/>
+      <w:numFmt w:val="bullet"/>
+      <w:lvlText w:val=""/>
+      <w:lvlJc w:val="left"/>
+      <w:pPr>
+        <w:tabs>
+          <w:tab w:val="num" w:pos="5040"/>
+        </w:tabs>
+        <w:ind w:left="5040" w:hanging="360"/>
+      </w:pPr>
+      <w:rPr>
+        <w:rFonts w:ascii="Symbol" w:hAnsi="Symbol" w:hint="default"/>
+        <w:sz w:val="20"/>
+      </w:rPr>
+    </w:lvl>
+    <w:lvl w:ilvl="7" w:tentative="1">
+      <w:start w:val="1"/>
+      <w:numFmt w:val="bullet"/>
+      <w:lvlText w:val=""/>
+      <w:lvlJc w:val="left"/>
+      <w:pPr>
+        <w:tabs>
+          <w:tab w:val="num" w:pos="5760"/>
+        </w:tabs>
+        <w:ind w:left="5760" w:hanging="360"/>
+      </w:pPr>
+      <w:rPr>
+        <w:rFonts w:ascii="Symbol" w:hAnsi="Symbol" w:hint="default"/>
+        <w:sz w:val="20"/>
+      </w:rPr>
+    </w:lvl>
+    <w:lvl w:ilvl="8" w:tentative="1">
+      <w:start w:val="1"/>
+      <w:numFmt w:val="bullet"/>
+      <w:lvlText w:val=""/>
+      <w:lvlJc w:val="left"/>
+      <w:pPr>
+        <w:tabs>
+          <w:tab w:val="num" w:pos="6480"/>
+        </w:tabs>
+        <w:ind w:left="6480" w:hanging="360"/>
+      </w:pPr>
+      <w:rPr>
+        <w:rFonts w:ascii="Symbol" w:hAnsi="Symbol" w:hint="default"/>
+        <w:sz w:val="20"/>
+      </w:rPr>
+    </w:lvl>
+  </w:abstractNum>
+  <w:abstractNum w:abstractNumId="15" w15:restartNumberingAfterBreak="0">
+    <w:nsid w:val="1CDE2397"/>
+    <w:multiLevelType w:val="multilevel"/>
+    <w:tmpl w:val="457E775C"/>
+    <w:lvl w:ilvl="0">
+      <w:start w:val="1"/>
+      <w:numFmt w:val="bullet"/>
+      <w:lvlText w:val=""/>
+      <w:lvlJc w:val="left"/>
+      <w:pPr>
+        <w:tabs>
+          <w:tab w:val="num" w:pos="720"/>
+        </w:tabs>
+        <w:ind w:left="720" w:hanging="360"/>
+      </w:pPr>
+      <w:rPr>
+        <w:rFonts w:ascii="Symbol" w:hAnsi="Symbol" w:hint="default"/>
+        <w:sz w:val="20"/>
+      </w:rPr>
+    </w:lvl>
+    <w:lvl w:ilvl="1" w:tentative="1">
+      <w:start w:val="1"/>
+      <w:numFmt w:val="bullet"/>
+      <w:lvlText w:val=""/>
+      <w:lvlJc w:val="left"/>
+      <w:pPr>
+        <w:tabs>
+          <w:tab w:val="num" w:pos="1440"/>
+        </w:tabs>
+        <w:ind w:left="1440" w:hanging="360"/>
+      </w:pPr>
+      <w:rPr>
+        <w:rFonts w:ascii="Symbol" w:hAnsi="Symbol" w:hint="default"/>
+        <w:sz w:val="20"/>
+      </w:rPr>
+    </w:lvl>
+    <w:lvl w:ilvl="2" w:tentative="1">
+      <w:start w:val="1"/>
+      <w:numFmt w:val="bullet"/>
+      <w:lvlText w:val=""/>
+      <w:lvlJc w:val="left"/>
+      <w:pPr>
+        <w:tabs>
+          <w:tab w:val="num" w:pos="2160"/>
+        </w:tabs>
+        <w:ind w:left="2160" w:hanging="360"/>
+      </w:pPr>
+      <w:rPr>
+        <w:rFonts w:ascii="Symbol" w:hAnsi="Symbol" w:hint="default"/>
+        <w:sz w:val="20"/>
+      </w:rPr>
+    </w:lvl>
+    <w:lvl w:ilvl="3" w:tentative="1">
+      <w:start w:val="1"/>
+      <w:numFmt w:val="bullet"/>
+      <w:lvlText w:val=""/>
+      <w:lvlJc w:val="left"/>
+      <w:pPr>
+        <w:tabs>
+          <w:tab w:val="num" w:pos="2880"/>
+        </w:tabs>
+        <w:ind w:left="2880" w:hanging="360"/>
+      </w:pPr>
+      <w:rPr>
+        <w:rFonts w:ascii="Symbol" w:hAnsi="Symbol" w:hint="default"/>
+        <w:sz w:val="20"/>
+      </w:rPr>
+    </w:lvl>
+    <w:lvl w:ilvl="4" w:tentative="1">
+      <w:start w:val="1"/>
+      <w:numFmt w:val="bullet"/>
+      <w:lvlText w:val=""/>
+      <w:lvlJc w:val="left"/>
+      <w:pPr>
+        <w:tabs>
+          <w:tab w:val="num" w:pos="3600"/>
+        </w:tabs>
+        <w:ind w:left="3600" w:hanging="360"/>
+      </w:pPr>
+      <w:rPr>
+        <w:rFonts w:ascii="Symbol" w:hAnsi="Symbol" w:hint="default"/>
+        <w:sz w:val="20"/>
+      </w:rPr>
+    </w:lvl>
+    <w:lvl w:ilvl="5" w:tentative="1">
+      <w:start w:val="1"/>
+      <w:numFmt w:val="bullet"/>
+      <w:lvlText w:val=""/>
+      <w:lvlJc w:val="left"/>
+      <w:pPr>
+        <w:tabs>
+          <w:tab w:val="num" w:pos="4320"/>
+        </w:tabs>
+        <w:ind w:left="4320" w:hanging="360"/>
+      </w:pPr>
+      <w:rPr>
+        <w:rFonts w:ascii="Symbol" w:hAnsi="Symbol" w:hint="default"/>
+        <w:sz w:val="20"/>
+      </w:rPr>
+    </w:lvl>
+    <w:lvl w:ilvl="6" w:tentative="1">
+      <w:start w:val="1"/>
+      <w:numFmt w:val="bullet"/>
+      <w:lvlText w:val=""/>
+      <w:lvlJc w:val="left"/>
+      <w:pPr>
+        <w:tabs>
+          <w:tab w:val="num" w:pos="5040"/>
+        </w:tabs>
+        <w:ind w:left="5040" w:hanging="360"/>
+      </w:pPr>
+      <w:rPr>
+        <w:rFonts w:ascii="Symbol" w:hAnsi="Symbol" w:hint="default"/>
+        <w:sz w:val="20"/>
+      </w:rPr>
+    </w:lvl>
+    <w:lvl w:ilvl="7" w:tentative="1">
+      <w:start w:val="1"/>
+      <w:numFmt w:val="bullet"/>
+      <w:lvlText w:val=""/>
+      <w:lvlJc w:val="left"/>
+      <w:pPr>
+        <w:tabs>
+          <w:tab w:val="num" w:pos="5760"/>
+        </w:tabs>
+        <w:ind w:left="5760" w:hanging="360"/>
+      </w:pPr>
+      <w:rPr>
+        <w:rFonts w:ascii="Symbol" w:hAnsi="Symbol" w:hint="default"/>
+        <w:sz w:val="20"/>
+      </w:rPr>
+    </w:lvl>
+    <w:lvl w:ilvl="8" w:tentative="1">
+      <w:start w:val="1"/>
+      <w:numFmt w:val="bullet"/>
+      <w:lvlText w:val=""/>
+      <w:lvlJc w:val="left"/>
+      <w:pPr>
+        <w:tabs>
+          <w:tab w:val="num" w:pos="6480"/>
+        </w:tabs>
+        <w:ind w:left="6480" w:hanging="360"/>
+      </w:pPr>
+      <w:rPr>
+        <w:rFonts w:ascii="Symbol" w:hAnsi="Symbol" w:hint="default"/>
+        <w:sz w:val="20"/>
+      </w:rPr>
+    </w:lvl>
+  </w:abstractNum>
+  <w:abstractNum w:abstractNumId="16" w15:restartNumberingAfterBreak="0">
     <w:nsid w:val="204C3736"/>
     <w:multiLevelType w:val="multilevel"/>
     <w:tmpl w:val="C394C20E"/>
@@ -5344,7 +6249,156 @@
       </w:rPr>
     </w:lvl>
   </w:abstractNum>
-  <w:abstractNum w:abstractNumId="14" w15:restartNumberingAfterBreak="0">
+  <w:abstractNum w:abstractNumId="17" w15:restartNumberingAfterBreak="0">
+    <w:nsid w:val="20A924C9"/>
+    <w:multiLevelType w:val="multilevel"/>
+    <w:tmpl w:val="E04082C4"/>
+    <w:lvl w:ilvl="0">
+      <w:start w:val="1"/>
+      <w:numFmt w:val="bullet"/>
+      <w:lvlText w:val=""/>
+      <w:lvlJc w:val="left"/>
+      <w:pPr>
+        <w:tabs>
+          <w:tab w:val="num" w:pos="720"/>
+        </w:tabs>
+        <w:ind w:left="720" w:hanging="360"/>
+      </w:pPr>
+      <w:rPr>
+        <w:rFonts w:ascii="Symbol" w:hAnsi="Symbol" w:hint="default"/>
+        <w:sz w:val="20"/>
+      </w:rPr>
+    </w:lvl>
+    <w:lvl w:ilvl="1" w:tentative="1">
+      <w:start w:val="1"/>
+      <w:numFmt w:val="bullet"/>
+      <w:lvlText w:val=""/>
+      <w:lvlJc w:val="left"/>
+      <w:pPr>
+        <w:tabs>
+          <w:tab w:val="num" w:pos="1440"/>
+        </w:tabs>
+        <w:ind w:left="1440" w:hanging="360"/>
+      </w:pPr>
+      <w:rPr>
+        <w:rFonts w:ascii="Symbol" w:hAnsi="Symbol" w:hint="default"/>
+        <w:sz w:val="20"/>
+      </w:rPr>
+    </w:lvl>
+    <w:lvl w:ilvl="2" w:tentative="1">
+      <w:start w:val="1"/>
+      <w:numFmt w:val="bullet"/>
+      <w:lvlText w:val=""/>
+      <w:lvlJc w:val="left"/>
+      <w:pPr>
+        <w:tabs>
+          <w:tab w:val="num" w:pos="2160"/>
+        </w:tabs>
+        <w:ind w:left="2160" w:hanging="360"/>
+      </w:pPr>
+      <w:rPr>
+        <w:rFonts w:ascii="Symbol" w:hAnsi="Symbol" w:hint="default"/>
+        <w:sz w:val="20"/>
+      </w:rPr>
+    </w:lvl>
+    <w:lvl w:ilvl="3" w:tentative="1">
+      <w:start w:val="1"/>
+      <w:numFmt w:val="bullet"/>
+      <w:lvlText w:val=""/>
+      <w:lvlJc w:val="left"/>
+      <w:pPr>
+        <w:tabs>
+          <w:tab w:val="num" w:pos="2880"/>
+        </w:tabs>
+        <w:ind w:left="2880" w:hanging="360"/>
+      </w:pPr>
+      <w:rPr>
+        <w:rFonts w:ascii="Symbol" w:hAnsi="Symbol" w:hint="default"/>
+        <w:sz w:val="20"/>
+      </w:rPr>
+    </w:lvl>
+    <w:lvl w:ilvl="4" w:tentative="1">
+      <w:start w:val="1"/>
+      <w:numFmt w:val="bullet"/>
+      <w:lvlText w:val=""/>
+      <w:lvlJc w:val="left"/>
+      <w:pPr>
+        <w:tabs>
+          <w:tab w:val="num" w:pos="3600"/>
+        </w:tabs>
+        <w:ind w:left="3600" w:hanging="360"/>
+      </w:pPr>
+      <w:rPr>
+        <w:rFonts w:ascii="Symbol" w:hAnsi="Symbol" w:hint="default"/>
+        <w:sz w:val="20"/>
+      </w:rPr>
+    </w:lvl>
+    <w:lvl w:ilvl="5" w:tentative="1">
+      <w:start w:val="1"/>
+      <w:numFmt w:val="bullet"/>
+      <w:lvlText w:val=""/>
+      <w:lvlJc w:val="left"/>
+      <w:pPr>
+        <w:tabs>
+          <w:tab w:val="num" w:pos="4320"/>
+        </w:tabs>
+        <w:ind w:left="4320" w:hanging="360"/>
+      </w:pPr>
+      <w:rPr>
+        <w:rFonts w:ascii="Symbol" w:hAnsi="Symbol" w:hint="default"/>
+        <w:sz w:val="20"/>
+      </w:rPr>
+    </w:lvl>
+    <w:lvl w:ilvl="6" w:tentative="1">
+      <w:start w:val="1"/>
+      <w:numFmt w:val="bullet"/>
+      <w:lvlText w:val=""/>
+      <w:lvlJc w:val="left"/>
+      <w:pPr>
+        <w:tabs>
+          <w:tab w:val="num" w:pos="5040"/>
+        </w:tabs>
+        <w:ind w:left="5040" w:hanging="360"/>
+      </w:pPr>
+      <w:rPr>
+        <w:rFonts w:ascii="Symbol" w:hAnsi="Symbol" w:hint="default"/>
+        <w:sz w:val="20"/>
+      </w:rPr>
+    </w:lvl>
+    <w:lvl w:ilvl="7" w:tentative="1">
+      <w:start w:val="1"/>
+      <w:numFmt w:val="bullet"/>
+      <w:lvlText w:val=""/>
+      <w:lvlJc w:val="left"/>
+      <w:pPr>
+        <w:tabs>
+          <w:tab w:val="num" w:pos="5760"/>
+        </w:tabs>
+        <w:ind w:left="5760" w:hanging="360"/>
+      </w:pPr>
+      <w:rPr>
+        <w:rFonts w:ascii="Symbol" w:hAnsi="Symbol" w:hint="default"/>
+        <w:sz w:val="20"/>
+      </w:rPr>
+    </w:lvl>
+    <w:lvl w:ilvl="8" w:tentative="1">
+      <w:start w:val="1"/>
+      <w:numFmt w:val="bullet"/>
+      <w:lvlText w:val=""/>
+      <w:lvlJc w:val="left"/>
+      <w:pPr>
+        <w:tabs>
+          <w:tab w:val="num" w:pos="6480"/>
+        </w:tabs>
+        <w:ind w:left="6480" w:hanging="360"/>
+      </w:pPr>
+      <w:rPr>
+        <w:rFonts w:ascii="Symbol" w:hAnsi="Symbol" w:hint="default"/>
+        <w:sz w:val="20"/>
+      </w:rPr>
+    </w:lvl>
+  </w:abstractNum>
+  <w:abstractNum w:abstractNumId="18" w15:restartNumberingAfterBreak="0">
     <w:nsid w:val="2272207A"/>
     <w:multiLevelType w:val="multilevel"/>
     <w:tmpl w:val="371A5340"/>
@@ -5493,7 +6547,7 @@
       </w:rPr>
     </w:lvl>
   </w:abstractNum>
-  <w:abstractNum w:abstractNumId="15" w15:restartNumberingAfterBreak="0">
+  <w:abstractNum w:abstractNumId="19" w15:restartNumberingAfterBreak="0">
     <w:nsid w:val="24F91D3C"/>
     <w:multiLevelType w:val="multilevel"/>
     <w:tmpl w:val="5B1CCE7A"/>
@@ -5642,7 +6696,7 @@
       </w:rPr>
     </w:lvl>
   </w:abstractNum>
-  <w:abstractNum w:abstractNumId="16" w15:restartNumberingAfterBreak="0">
+  <w:abstractNum w:abstractNumId="20" w15:restartNumberingAfterBreak="0">
     <w:nsid w:val="28643305"/>
     <w:multiLevelType w:val="multilevel"/>
     <w:tmpl w:val="20E2EAE4"/>
@@ -5791,7 +6845,7 @@
       </w:rPr>
     </w:lvl>
   </w:abstractNum>
-  <w:abstractNum w:abstractNumId="17" w15:restartNumberingAfterBreak="0">
+  <w:abstractNum w:abstractNumId="21" w15:restartNumberingAfterBreak="0">
     <w:nsid w:val="286F5F6D"/>
     <w:multiLevelType w:val="multilevel"/>
     <w:tmpl w:val="5BBA7798"/>
@@ -5940,7 +6994,156 @@
       </w:rPr>
     </w:lvl>
   </w:abstractNum>
-  <w:abstractNum w:abstractNumId="18" w15:restartNumberingAfterBreak="0">
+  <w:abstractNum w:abstractNumId="22" w15:restartNumberingAfterBreak="0">
+    <w:nsid w:val="2984748D"/>
+    <w:multiLevelType w:val="multilevel"/>
+    <w:tmpl w:val="2CC00586"/>
+    <w:lvl w:ilvl="0">
+      <w:start w:val="1"/>
+      <w:numFmt w:val="bullet"/>
+      <w:lvlText w:val=""/>
+      <w:lvlJc w:val="left"/>
+      <w:pPr>
+        <w:tabs>
+          <w:tab w:val="num" w:pos="720"/>
+        </w:tabs>
+        <w:ind w:left="720" w:hanging="360"/>
+      </w:pPr>
+      <w:rPr>
+        <w:rFonts w:ascii="Symbol" w:hAnsi="Symbol" w:hint="default"/>
+        <w:sz w:val="20"/>
+      </w:rPr>
+    </w:lvl>
+    <w:lvl w:ilvl="1" w:tentative="1">
+      <w:start w:val="1"/>
+      <w:numFmt w:val="bullet"/>
+      <w:lvlText w:val=""/>
+      <w:lvlJc w:val="left"/>
+      <w:pPr>
+        <w:tabs>
+          <w:tab w:val="num" w:pos="1440"/>
+        </w:tabs>
+        <w:ind w:left="1440" w:hanging="360"/>
+      </w:pPr>
+      <w:rPr>
+        <w:rFonts w:ascii="Symbol" w:hAnsi="Symbol" w:hint="default"/>
+        <w:sz w:val="20"/>
+      </w:rPr>
+    </w:lvl>
+    <w:lvl w:ilvl="2" w:tentative="1">
+      <w:start w:val="1"/>
+      <w:numFmt w:val="bullet"/>
+      <w:lvlText w:val=""/>
+      <w:lvlJc w:val="left"/>
+      <w:pPr>
+        <w:tabs>
+          <w:tab w:val="num" w:pos="2160"/>
+        </w:tabs>
+        <w:ind w:left="2160" w:hanging="360"/>
+      </w:pPr>
+      <w:rPr>
+        <w:rFonts w:ascii="Symbol" w:hAnsi="Symbol" w:hint="default"/>
+        <w:sz w:val="20"/>
+      </w:rPr>
+    </w:lvl>
+    <w:lvl w:ilvl="3" w:tentative="1">
+      <w:start w:val="1"/>
+      <w:numFmt w:val="bullet"/>
+      <w:lvlText w:val=""/>
+      <w:lvlJc w:val="left"/>
+      <w:pPr>
+        <w:tabs>
+          <w:tab w:val="num" w:pos="2880"/>
+        </w:tabs>
+        <w:ind w:left="2880" w:hanging="360"/>
+      </w:pPr>
+      <w:rPr>
+        <w:rFonts w:ascii="Symbol" w:hAnsi="Symbol" w:hint="default"/>
+        <w:sz w:val="20"/>
+      </w:rPr>
+    </w:lvl>
+    <w:lvl w:ilvl="4" w:tentative="1">
+      <w:start w:val="1"/>
+      <w:numFmt w:val="bullet"/>
+      <w:lvlText w:val=""/>
+      <w:lvlJc w:val="left"/>
+      <w:pPr>
+        <w:tabs>
+          <w:tab w:val="num" w:pos="3600"/>
+        </w:tabs>
+        <w:ind w:left="3600" w:hanging="360"/>
+      </w:pPr>
+      <w:rPr>
+        <w:rFonts w:ascii="Symbol" w:hAnsi="Symbol" w:hint="default"/>
+        <w:sz w:val="20"/>
+      </w:rPr>
+    </w:lvl>
+    <w:lvl w:ilvl="5" w:tentative="1">
+      <w:start w:val="1"/>
+      <w:numFmt w:val="bullet"/>
+      <w:lvlText w:val=""/>
+      <w:lvlJc w:val="left"/>
+      <w:pPr>
+        <w:tabs>
+          <w:tab w:val="num" w:pos="4320"/>
+        </w:tabs>
+        <w:ind w:left="4320" w:hanging="360"/>
+      </w:pPr>
+      <w:rPr>
+        <w:rFonts w:ascii="Symbol" w:hAnsi="Symbol" w:hint="default"/>
+        <w:sz w:val="20"/>
+      </w:rPr>
+    </w:lvl>
+    <w:lvl w:ilvl="6" w:tentative="1">
+      <w:start w:val="1"/>
+      <w:numFmt w:val="bullet"/>
+      <w:lvlText w:val=""/>
+      <w:lvlJc w:val="left"/>
+      <w:pPr>
+        <w:tabs>
+          <w:tab w:val="num" w:pos="5040"/>
+        </w:tabs>
+        <w:ind w:left="5040" w:hanging="360"/>
+      </w:pPr>
+      <w:rPr>
+        <w:rFonts w:ascii="Symbol" w:hAnsi="Symbol" w:hint="default"/>
+        <w:sz w:val="20"/>
+      </w:rPr>
+    </w:lvl>
+    <w:lvl w:ilvl="7" w:tentative="1">
+      <w:start w:val="1"/>
+      <w:numFmt w:val="bullet"/>
+      <w:lvlText w:val=""/>
+      <w:lvlJc w:val="left"/>
+      <w:pPr>
+        <w:tabs>
+          <w:tab w:val="num" w:pos="5760"/>
+        </w:tabs>
+        <w:ind w:left="5760" w:hanging="360"/>
+      </w:pPr>
+      <w:rPr>
+        <w:rFonts w:ascii="Symbol" w:hAnsi="Symbol" w:hint="default"/>
+        <w:sz w:val="20"/>
+      </w:rPr>
+    </w:lvl>
+    <w:lvl w:ilvl="8" w:tentative="1">
+      <w:start w:val="1"/>
+      <w:numFmt w:val="bullet"/>
+      <w:lvlText w:val=""/>
+      <w:lvlJc w:val="left"/>
+      <w:pPr>
+        <w:tabs>
+          <w:tab w:val="num" w:pos="6480"/>
+        </w:tabs>
+        <w:ind w:left="6480" w:hanging="360"/>
+      </w:pPr>
+      <w:rPr>
+        <w:rFonts w:ascii="Symbol" w:hAnsi="Symbol" w:hint="default"/>
+        <w:sz w:val="20"/>
+      </w:rPr>
+    </w:lvl>
+  </w:abstractNum>
+  <w:abstractNum w:abstractNumId="23" w15:restartNumberingAfterBreak="0">
     <w:nsid w:val="2BA75D22"/>
     <w:multiLevelType w:val="multilevel"/>
     <w:tmpl w:val="642206D6"/>
@@ -6089,7 +7292,156 @@
       </w:rPr>
     </w:lvl>
   </w:abstractNum>
-  <w:abstractNum w:abstractNumId="19" w15:restartNumberingAfterBreak="0">
+  <w:abstractNum w:abstractNumId="24" w15:restartNumberingAfterBreak="0">
+    <w:nsid w:val="2BB27D3D"/>
+    <w:multiLevelType w:val="multilevel"/>
+    <w:tmpl w:val="B9B253A6"/>
+    <w:lvl w:ilvl="0">
+      <w:start w:val="1"/>
+      <w:numFmt w:val="bullet"/>
+      <w:lvlText w:val=""/>
+      <w:lvlJc w:val="left"/>
+      <w:pPr>
+        <w:tabs>
+          <w:tab w:val="num" w:pos="720"/>
+        </w:tabs>
+        <w:ind w:left="720" w:hanging="360"/>
+      </w:pPr>
+      <w:rPr>
+        <w:rFonts w:ascii="Symbol" w:hAnsi="Symbol" w:hint="default"/>
+        <w:sz w:val="20"/>
+      </w:rPr>
+    </w:lvl>
+    <w:lvl w:ilvl="1" w:tentative="1">
+      <w:start w:val="1"/>
+      <w:numFmt w:val="bullet"/>
+      <w:lvlText w:val=""/>
+      <w:lvlJc w:val="left"/>
+      <w:pPr>
+        <w:tabs>
+          <w:tab w:val="num" w:pos="1440"/>
+        </w:tabs>
+        <w:ind w:left="1440" w:hanging="360"/>
+      </w:pPr>
+      <w:rPr>
+        <w:rFonts w:ascii="Symbol" w:hAnsi="Symbol" w:hint="default"/>
+        <w:sz w:val="20"/>
+      </w:rPr>
+    </w:lvl>
+    <w:lvl w:ilvl="2" w:tentative="1">
+      <w:start w:val="1"/>
+      <w:numFmt w:val="bullet"/>
+      <w:lvlText w:val=""/>
+      <w:lvlJc w:val="left"/>
+      <w:pPr>
+        <w:tabs>
+          <w:tab w:val="num" w:pos="2160"/>
+        </w:tabs>
+        <w:ind w:left="2160" w:hanging="360"/>
+      </w:pPr>
+      <w:rPr>
+        <w:rFonts w:ascii="Symbol" w:hAnsi="Symbol" w:hint="default"/>
+        <w:sz w:val="20"/>
+      </w:rPr>
+    </w:lvl>
+    <w:lvl w:ilvl="3" w:tentative="1">
+      <w:start w:val="1"/>
+      <w:numFmt w:val="bullet"/>
+      <w:lvlText w:val=""/>
+      <w:lvlJc w:val="left"/>
+      <w:pPr>
+        <w:tabs>
+          <w:tab w:val="num" w:pos="2880"/>
+        </w:tabs>
+        <w:ind w:left="2880" w:hanging="360"/>
+      </w:pPr>
+      <w:rPr>
+        <w:rFonts w:ascii="Symbol" w:hAnsi="Symbol" w:hint="default"/>
+        <w:sz w:val="20"/>
+      </w:rPr>
+    </w:lvl>
+    <w:lvl w:ilvl="4" w:tentative="1">
+      <w:start w:val="1"/>
+      <w:numFmt w:val="bullet"/>
+      <w:lvlText w:val=""/>
+      <w:lvlJc w:val="left"/>
+      <w:pPr>
+        <w:tabs>
+          <w:tab w:val="num" w:pos="3600"/>
+        </w:tabs>
+        <w:ind w:left="3600" w:hanging="360"/>
+      </w:pPr>
+      <w:rPr>
+        <w:rFonts w:ascii="Symbol" w:hAnsi="Symbol" w:hint="default"/>
+        <w:sz w:val="20"/>
+      </w:rPr>
+    </w:lvl>
+    <w:lvl w:ilvl="5" w:tentative="1">
+      <w:start w:val="1"/>
+      <w:numFmt w:val="bullet"/>
+      <w:lvlText w:val=""/>
+      <w:lvlJc w:val="left"/>
+      <w:pPr>
+        <w:tabs>
+          <w:tab w:val="num" w:pos="4320"/>
+        </w:tabs>
+        <w:ind w:left="4320" w:hanging="360"/>
+      </w:pPr>
+      <w:rPr>
+        <w:rFonts w:ascii="Symbol" w:hAnsi="Symbol" w:hint="default"/>
+        <w:sz w:val="20"/>
+      </w:rPr>
+    </w:lvl>
+    <w:lvl w:ilvl="6" w:tentative="1">
+      <w:start w:val="1"/>
+      <w:numFmt w:val="bullet"/>
+      <w:lvlText w:val=""/>
+      <w:lvlJc w:val="left"/>
+      <w:pPr>
+        <w:tabs>
+          <w:tab w:val="num" w:pos="5040"/>
+        </w:tabs>
+        <w:ind w:left="5040" w:hanging="360"/>
+      </w:pPr>
+      <w:rPr>
+        <w:rFonts w:ascii="Symbol" w:hAnsi="Symbol" w:hint="default"/>
+        <w:sz w:val="20"/>
+      </w:rPr>
+    </w:lvl>
+    <w:lvl w:ilvl="7" w:tentative="1">
+      <w:start w:val="1"/>
+      <w:numFmt w:val="bullet"/>
+      <w:lvlText w:val=""/>
+      <w:lvlJc w:val="left"/>
+      <w:pPr>
+        <w:tabs>
+          <w:tab w:val="num" w:pos="5760"/>
+        </w:tabs>
+        <w:ind w:left="5760" w:hanging="360"/>
+      </w:pPr>
+      <w:rPr>
+        <w:rFonts w:ascii="Symbol" w:hAnsi="Symbol" w:hint="default"/>
+        <w:sz w:val="20"/>
+      </w:rPr>
+    </w:lvl>
+    <w:lvl w:ilvl="8" w:tentative="1">
+      <w:start w:val="1"/>
+      <w:numFmt w:val="bullet"/>
+      <w:lvlText w:val=""/>
+      <w:lvlJc w:val="left"/>
+      <w:pPr>
+        <w:tabs>
+          <w:tab w:val="num" w:pos="6480"/>
+        </w:tabs>
+        <w:ind w:left="6480" w:hanging="360"/>
+      </w:pPr>
+      <w:rPr>
+        <w:rFonts w:ascii="Symbol" w:hAnsi="Symbol" w:hint="default"/>
+        <w:sz w:val="20"/>
+      </w:rPr>
+    </w:lvl>
+  </w:abstractNum>
+  <w:abstractNum w:abstractNumId="25" w15:restartNumberingAfterBreak="0">
     <w:nsid w:val="2C0E3E4C"/>
     <w:multiLevelType w:val="multilevel"/>
     <w:tmpl w:val="46C43CA8"/>
@@ -6238,7 +7590,7 @@
       </w:rPr>
     </w:lvl>
   </w:abstractNum>
-  <w:abstractNum w:abstractNumId="20" w15:restartNumberingAfterBreak="0">
+  <w:abstractNum w:abstractNumId="26" w15:restartNumberingAfterBreak="0">
     <w:nsid w:val="2E31510E"/>
     <w:multiLevelType w:val="multilevel"/>
     <w:tmpl w:val="A8B0FD2C"/>
@@ -6387,7 +7739,7 @@
       </w:rPr>
     </w:lvl>
   </w:abstractNum>
-  <w:abstractNum w:abstractNumId="21" w15:restartNumberingAfterBreak="0">
+  <w:abstractNum w:abstractNumId="27" w15:restartNumberingAfterBreak="0">
     <w:nsid w:val="327E4735"/>
     <w:multiLevelType w:val="multilevel"/>
     <w:tmpl w:val="01BCF84A"/>
@@ -6536,7 +7888,7 @@
       </w:rPr>
     </w:lvl>
   </w:abstractNum>
-  <w:abstractNum w:abstractNumId="22" w15:restartNumberingAfterBreak="0">
+  <w:abstractNum w:abstractNumId="28" w15:restartNumberingAfterBreak="0">
     <w:nsid w:val="3C90247C"/>
     <w:multiLevelType w:val="multilevel"/>
     <w:tmpl w:val="DD128056"/>
@@ -6685,7 +8037,156 @@
       </w:rPr>
     </w:lvl>
   </w:abstractNum>
-  <w:abstractNum w:abstractNumId="23" w15:restartNumberingAfterBreak="0">
+  <w:abstractNum w:abstractNumId="29" w15:restartNumberingAfterBreak="0">
+    <w:nsid w:val="3E49363D"/>
+    <w:multiLevelType w:val="multilevel"/>
+    <w:tmpl w:val="DDC42CEA"/>
+    <w:lvl w:ilvl="0">
+      <w:start w:val="1"/>
+      <w:numFmt w:val="bullet"/>
+      <w:lvlText w:val=""/>
+      <w:lvlJc w:val="left"/>
+      <w:pPr>
+        <w:tabs>
+          <w:tab w:val="num" w:pos="720"/>
+        </w:tabs>
+        <w:ind w:left="720" w:hanging="360"/>
+      </w:pPr>
+      <w:rPr>
+        <w:rFonts w:ascii="Symbol" w:hAnsi="Symbol" w:hint="default"/>
+        <w:sz w:val="20"/>
+      </w:rPr>
+    </w:lvl>
+    <w:lvl w:ilvl="1" w:tentative="1">
+      <w:start w:val="1"/>
+      <w:numFmt w:val="bullet"/>
+      <w:lvlText w:val=""/>
+      <w:lvlJc w:val="left"/>
+      <w:pPr>
+        <w:tabs>
+          <w:tab w:val="num" w:pos="1440"/>
+        </w:tabs>
+        <w:ind w:left="1440" w:hanging="360"/>
+      </w:pPr>
+      <w:rPr>
+        <w:rFonts w:ascii="Symbol" w:hAnsi="Symbol" w:hint="default"/>
+        <w:sz w:val="20"/>
+      </w:rPr>
+    </w:lvl>
+    <w:lvl w:ilvl="2" w:tentative="1">
+      <w:start w:val="1"/>
+      <w:numFmt w:val="bullet"/>
+      <w:lvlText w:val=""/>
+      <w:lvlJc w:val="left"/>
+      <w:pPr>
+        <w:tabs>
+          <w:tab w:val="num" w:pos="2160"/>
+        </w:tabs>
+        <w:ind w:left="2160" w:hanging="360"/>
+      </w:pPr>
+      <w:rPr>
+        <w:rFonts w:ascii="Symbol" w:hAnsi="Symbol" w:hint="default"/>
+        <w:sz w:val="20"/>
+      </w:rPr>
+    </w:lvl>
+    <w:lvl w:ilvl="3" w:tentative="1">
+      <w:start w:val="1"/>
+      <w:numFmt w:val="bullet"/>
+      <w:lvlText w:val=""/>
+      <w:lvlJc w:val="left"/>
+      <w:pPr>
+        <w:tabs>
+          <w:tab w:val="num" w:pos="2880"/>
+        </w:tabs>
+        <w:ind w:left="2880" w:hanging="360"/>
+      </w:pPr>
+      <w:rPr>
+        <w:rFonts w:ascii="Symbol" w:hAnsi="Symbol" w:hint="default"/>
+        <w:sz w:val="20"/>
+      </w:rPr>
+    </w:lvl>
+    <w:lvl w:ilvl="4" w:tentative="1">
+      <w:start w:val="1"/>
+      <w:numFmt w:val="bullet"/>
+      <w:lvlText w:val=""/>
+      <w:lvlJc w:val="left"/>
+      <w:pPr>
+        <w:tabs>
+          <w:tab w:val="num" w:pos="3600"/>
+        </w:tabs>
+        <w:ind w:left="3600" w:hanging="360"/>
+      </w:pPr>
+      <w:rPr>
+        <w:rFonts w:ascii="Symbol" w:hAnsi="Symbol" w:hint="default"/>
+        <w:sz w:val="20"/>
+      </w:rPr>
+    </w:lvl>
+    <w:lvl w:ilvl="5" w:tentative="1">
+      <w:start w:val="1"/>
+      <w:numFmt w:val="bullet"/>
+      <w:lvlText w:val=""/>
+      <w:lvlJc w:val="left"/>
+      <w:pPr>
+        <w:tabs>
+          <w:tab w:val="num" w:pos="4320"/>
+        </w:tabs>
+        <w:ind w:left="4320" w:hanging="360"/>
+      </w:pPr>
+      <w:rPr>
+        <w:rFonts w:ascii="Symbol" w:hAnsi="Symbol" w:hint="default"/>
+        <w:sz w:val="20"/>
+      </w:rPr>
+    </w:lvl>
+    <w:lvl w:ilvl="6" w:tentative="1">
+      <w:start w:val="1"/>
+      <w:numFmt w:val="bullet"/>
+      <w:lvlText w:val=""/>
+      <w:lvlJc w:val="left"/>
+      <w:pPr>
+        <w:tabs>
+          <w:tab w:val="num" w:pos="5040"/>
+        </w:tabs>
+        <w:ind w:left="5040" w:hanging="360"/>
+      </w:pPr>
+      <w:rPr>
+        <w:rFonts w:ascii="Symbol" w:hAnsi="Symbol" w:hint="default"/>
+        <w:sz w:val="20"/>
+      </w:rPr>
+    </w:lvl>
+    <w:lvl w:ilvl="7" w:tentative="1">
+      <w:start w:val="1"/>
+      <w:numFmt w:val="bullet"/>
+      <w:lvlText w:val=""/>
+      <w:lvlJc w:val="left"/>
+      <w:pPr>
+        <w:tabs>
+          <w:tab w:val="num" w:pos="5760"/>
+        </w:tabs>
+        <w:ind w:left="5760" w:hanging="360"/>
+      </w:pPr>
+      <w:rPr>
+        <w:rFonts w:ascii="Symbol" w:hAnsi="Symbol" w:hint="default"/>
+        <w:sz w:val="20"/>
+      </w:rPr>
+    </w:lvl>
+    <w:lvl w:ilvl="8" w:tentative="1">
+      <w:start w:val="1"/>
+      <w:numFmt w:val="bullet"/>
+      <w:lvlText w:val=""/>
+      <w:lvlJc w:val="left"/>
+      <w:pPr>
+        <w:tabs>
+          <w:tab w:val="num" w:pos="6480"/>
+        </w:tabs>
+        <w:ind w:left="6480" w:hanging="360"/>
+      </w:pPr>
+      <w:rPr>
+        <w:rFonts w:ascii="Symbol" w:hAnsi="Symbol" w:hint="default"/>
+        <w:sz w:val="20"/>
+      </w:rPr>
+    </w:lvl>
+  </w:abstractNum>
+  <w:abstractNum w:abstractNumId="30" w15:restartNumberingAfterBreak="0">
     <w:nsid w:val="4147715D"/>
     <w:multiLevelType w:val="multilevel"/>
     <w:tmpl w:val="8CB6A5D2"/>
@@ -6834,7 +8335,7 @@
       </w:rPr>
     </w:lvl>
   </w:abstractNum>
-  <w:abstractNum w:abstractNumId="24" w15:restartNumberingAfterBreak="0">
+  <w:abstractNum w:abstractNumId="31" w15:restartNumberingAfterBreak="0">
     <w:nsid w:val="4EDB778F"/>
     <w:multiLevelType w:val="multilevel"/>
     <w:tmpl w:val="0D5E2B50"/>
@@ -6983,7 +8484,7 @@
       </w:rPr>
     </w:lvl>
   </w:abstractNum>
-  <w:abstractNum w:abstractNumId="25" w15:restartNumberingAfterBreak="0">
+  <w:abstractNum w:abstractNumId="32" w15:restartNumberingAfterBreak="0">
     <w:nsid w:val="4F970AB0"/>
     <w:multiLevelType w:val="multilevel"/>
     <w:tmpl w:val="7290690E"/>
@@ -7132,7 +8633,7 @@
       </w:rPr>
     </w:lvl>
   </w:abstractNum>
-  <w:abstractNum w:abstractNumId="26" w15:restartNumberingAfterBreak="0">
+  <w:abstractNum w:abstractNumId="33" w15:restartNumberingAfterBreak="0">
     <w:nsid w:val="539374A4"/>
     <w:multiLevelType w:val="multilevel"/>
     <w:tmpl w:val="FC525C72"/>
@@ -7281,7 +8782,7 @@
       </w:rPr>
     </w:lvl>
   </w:abstractNum>
-  <w:abstractNum w:abstractNumId="27" w15:restartNumberingAfterBreak="0">
+  <w:abstractNum w:abstractNumId="34" w15:restartNumberingAfterBreak="0">
     <w:nsid w:val="54614E99"/>
     <w:multiLevelType w:val="multilevel"/>
     <w:tmpl w:val="1848DD06"/>
@@ -7430,7 +8931,156 @@
       </w:rPr>
     </w:lvl>
   </w:abstractNum>
-  <w:abstractNum w:abstractNumId="28" w15:restartNumberingAfterBreak="0">
+  <w:abstractNum w:abstractNumId="35" w15:restartNumberingAfterBreak="0">
+    <w:nsid w:val="5C086856"/>
+    <w:multiLevelType w:val="multilevel"/>
+    <w:tmpl w:val="E2567B90"/>
+    <w:lvl w:ilvl="0">
+      <w:start w:val="1"/>
+      <w:numFmt w:val="bullet"/>
+      <w:lvlText w:val=""/>
+      <w:lvlJc w:val="left"/>
+      <w:pPr>
+        <w:tabs>
+          <w:tab w:val="num" w:pos="720"/>
+        </w:tabs>
+        <w:ind w:left="720" w:hanging="360"/>
+      </w:pPr>
+      <w:rPr>
+        <w:rFonts w:ascii="Symbol" w:hAnsi="Symbol" w:hint="default"/>
+        <w:sz w:val="20"/>
+      </w:rPr>
+    </w:lvl>
+    <w:lvl w:ilvl="1" w:tentative="1">
+      <w:start w:val="1"/>
+      <w:numFmt w:val="bullet"/>
+      <w:lvlText w:val=""/>
+      <w:lvlJc w:val="left"/>
+      <w:pPr>
+        <w:tabs>
+          <w:tab w:val="num" w:pos="1440"/>
+        </w:tabs>
+        <w:ind w:left="1440" w:hanging="360"/>
+      </w:pPr>
+      <w:rPr>
+        <w:rFonts w:ascii="Symbol" w:hAnsi="Symbol" w:hint="default"/>
+        <w:sz w:val="20"/>
+      </w:rPr>
+    </w:lvl>
+    <w:lvl w:ilvl="2" w:tentative="1">
+      <w:start w:val="1"/>
+      <w:numFmt w:val="bullet"/>
+      <w:lvlText w:val=""/>
+      <w:lvlJc w:val="left"/>
+      <w:pPr>
+        <w:tabs>
+          <w:tab w:val="num" w:pos="2160"/>
+        </w:tabs>
+        <w:ind w:left="2160" w:hanging="360"/>
+      </w:pPr>
+      <w:rPr>
+        <w:rFonts w:ascii="Symbol" w:hAnsi="Symbol" w:hint="default"/>
+        <w:sz w:val="20"/>
+      </w:rPr>
+    </w:lvl>
+    <w:lvl w:ilvl="3" w:tentative="1">
+      <w:start w:val="1"/>
+      <w:numFmt w:val="bullet"/>
+      <w:lvlText w:val=""/>
+      <w:lvlJc w:val="left"/>
+      <w:pPr>
+        <w:tabs>
+          <w:tab w:val="num" w:pos="2880"/>
+        </w:tabs>
+        <w:ind w:left="2880" w:hanging="360"/>
+      </w:pPr>
+      <w:rPr>
+        <w:rFonts w:ascii="Symbol" w:hAnsi="Symbol" w:hint="default"/>
+        <w:sz w:val="20"/>
+      </w:rPr>
+    </w:lvl>
+    <w:lvl w:ilvl="4" w:tentative="1">
+      <w:start w:val="1"/>
+      <w:numFmt w:val="bullet"/>
+      <w:lvlText w:val=""/>
+      <w:lvlJc w:val="left"/>
+      <w:pPr>
+        <w:tabs>
+          <w:tab w:val="num" w:pos="3600"/>
+        </w:tabs>
+        <w:ind w:left="3600" w:hanging="360"/>
+      </w:pPr>
+      <w:rPr>
+        <w:rFonts w:ascii="Symbol" w:hAnsi="Symbol" w:hint="default"/>
+        <w:sz w:val="20"/>
+      </w:rPr>
+    </w:lvl>
+    <w:lvl w:ilvl="5" w:tentative="1">
+      <w:start w:val="1"/>
+      <w:numFmt w:val="bullet"/>
+      <w:lvlText w:val=""/>
+      <w:lvlJc w:val="left"/>
+      <w:pPr>
+        <w:tabs>
+          <w:tab w:val="num" w:pos="4320"/>
+        </w:tabs>
+        <w:ind w:left="4320" w:hanging="360"/>
+      </w:pPr>
+      <w:rPr>
+        <w:rFonts w:ascii="Symbol" w:hAnsi="Symbol" w:hint="default"/>
+        <w:sz w:val="20"/>
+      </w:rPr>
+    </w:lvl>
+    <w:lvl w:ilvl="6" w:tentative="1">
+      <w:start w:val="1"/>
+      <w:numFmt w:val="bullet"/>
+      <w:lvlText w:val=""/>
+      <w:lvlJc w:val="left"/>
+      <w:pPr>
+        <w:tabs>
+          <w:tab w:val="num" w:pos="5040"/>
+        </w:tabs>
+        <w:ind w:left="5040" w:hanging="360"/>
+      </w:pPr>
+      <w:rPr>
+        <w:rFonts w:ascii="Symbol" w:hAnsi="Symbol" w:hint="default"/>
+        <w:sz w:val="20"/>
+      </w:rPr>
+    </w:lvl>
+    <w:lvl w:ilvl="7" w:tentative="1">
+      <w:start w:val="1"/>
+      <w:numFmt w:val="bullet"/>
+      <w:lvlText w:val=""/>
+      <w:lvlJc w:val="left"/>
+      <w:pPr>
+        <w:tabs>
+          <w:tab w:val="num" w:pos="5760"/>
+        </w:tabs>
+        <w:ind w:left="5760" w:hanging="360"/>
+      </w:pPr>
+      <w:rPr>
+        <w:rFonts w:ascii="Symbol" w:hAnsi="Symbol" w:hint="default"/>
+        <w:sz w:val="20"/>
+      </w:rPr>
+    </w:lvl>
+    <w:lvl w:ilvl="8" w:tentative="1">
+      <w:start w:val="1"/>
+      <w:numFmt w:val="bullet"/>
+      <w:lvlText w:val=""/>
+      <w:lvlJc w:val="left"/>
+      <w:pPr>
+        <w:tabs>
+          <w:tab w:val="num" w:pos="6480"/>
+        </w:tabs>
+        <w:ind w:left="6480" w:hanging="360"/>
+      </w:pPr>
+      <w:rPr>
+        <w:rFonts w:ascii="Symbol" w:hAnsi="Symbol" w:hint="default"/>
+        <w:sz w:val="20"/>
+      </w:rPr>
+    </w:lvl>
+  </w:abstractNum>
+  <w:abstractNum w:abstractNumId="36" w15:restartNumberingAfterBreak="0">
     <w:nsid w:val="5D0A1B6D"/>
     <w:multiLevelType w:val="multilevel"/>
     <w:tmpl w:val="DB4A2608"/>
@@ -7579,7 +9229,7 @@
       </w:rPr>
     </w:lvl>
   </w:abstractNum>
-  <w:abstractNum w:abstractNumId="29" w15:restartNumberingAfterBreak="0">
+  <w:abstractNum w:abstractNumId="37" w15:restartNumberingAfterBreak="0">
     <w:nsid w:val="5F883E9C"/>
     <w:multiLevelType w:val="multilevel"/>
     <w:tmpl w:val="56C65F18"/>
@@ -7728,7 +9378,156 @@
       </w:rPr>
     </w:lvl>
   </w:abstractNum>
-  <w:abstractNum w:abstractNumId="30" w15:restartNumberingAfterBreak="0">
+  <w:abstractNum w:abstractNumId="38" w15:restartNumberingAfterBreak="0">
+    <w:nsid w:val="5FF75789"/>
+    <w:multiLevelType w:val="multilevel"/>
+    <w:tmpl w:val="C158E2D2"/>
+    <w:lvl w:ilvl="0">
+      <w:start w:val="1"/>
+      <w:numFmt w:val="bullet"/>
+      <w:lvlText w:val=""/>
+      <w:lvlJc w:val="left"/>
+      <w:pPr>
+        <w:tabs>
+          <w:tab w:val="num" w:pos="720"/>
+        </w:tabs>
+        <w:ind w:left="720" w:hanging="360"/>
+      </w:pPr>
+      <w:rPr>
+        <w:rFonts w:ascii="Symbol" w:hAnsi="Symbol" w:hint="default"/>
+        <w:sz w:val="20"/>
+      </w:rPr>
+    </w:lvl>
+    <w:lvl w:ilvl="1" w:tentative="1">
+      <w:start w:val="1"/>
+      <w:numFmt w:val="bullet"/>
+      <w:lvlText w:val=""/>
+      <w:lvlJc w:val="left"/>
+      <w:pPr>
+        <w:tabs>
+          <w:tab w:val="num" w:pos="1440"/>
+        </w:tabs>
+        <w:ind w:left="1440" w:hanging="360"/>
+      </w:pPr>
+      <w:rPr>
+        <w:rFonts w:ascii="Symbol" w:hAnsi="Symbol" w:hint="default"/>
+        <w:sz w:val="20"/>
+      </w:rPr>
+    </w:lvl>
+    <w:lvl w:ilvl="2" w:tentative="1">
+      <w:start w:val="1"/>
+      <w:numFmt w:val="bullet"/>
+      <w:lvlText w:val=""/>
+      <w:lvlJc w:val="left"/>
+      <w:pPr>
+        <w:tabs>
+          <w:tab w:val="num" w:pos="2160"/>
+        </w:tabs>
+        <w:ind w:left="2160" w:hanging="360"/>
+      </w:pPr>
+      <w:rPr>
+        <w:rFonts w:ascii="Symbol" w:hAnsi="Symbol" w:hint="default"/>
+        <w:sz w:val="20"/>
+      </w:rPr>
+    </w:lvl>
+    <w:lvl w:ilvl="3" w:tentative="1">
+      <w:start w:val="1"/>
+      <w:numFmt w:val="bullet"/>
+      <w:lvlText w:val=""/>
+      <w:lvlJc w:val="left"/>
+      <w:pPr>
+        <w:tabs>
+          <w:tab w:val="num" w:pos="2880"/>
+        </w:tabs>
+        <w:ind w:left="2880" w:hanging="360"/>
+      </w:pPr>
+      <w:rPr>
+        <w:rFonts w:ascii="Symbol" w:hAnsi="Symbol" w:hint="default"/>
+        <w:sz w:val="20"/>
+      </w:rPr>
+    </w:lvl>
+    <w:lvl w:ilvl="4" w:tentative="1">
+      <w:start w:val="1"/>
+      <w:numFmt w:val="bullet"/>
+      <w:lvlText w:val=""/>
+      <w:lvlJc w:val="left"/>
+      <w:pPr>
+        <w:tabs>
+          <w:tab w:val="num" w:pos="3600"/>
+        </w:tabs>
+        <w:ind w:left="3600" w:hanging="360"/>
+      </w:pPr>
+      <w:rPr>
+        <w:rFonts w:ascii="Symbol" w:hAnsi="Symbol" w:hint="default"/>
+        <w:sz w:val="20"/>
+      </w:rPr>
+    </w:lvl>
+    <w:lvl w:ilvl="5" w:tentative="1">
+      <w:start w:val="1"/>
+      <w:numFmt w:val="bullet"/>
+      <w:lvlText w:val=""/>
+      <w:lvlJc w:val="left"/>
+      <w:pPr>
+        <w:tabs>
+          <w:tab w:val="num" w:pos="4320"/>
+        </w:tabs>
+        <w:ind w:left="4320" w:hanging="360"/>
+      </w:pPr>
+      <w:rPr>
+        <w:rFonts w:ascii="Symbol" w:hAnsi="Symbol" w:hint="default"/>
+        <w:sz w:val="20"/>
+      </w:rPr>
+    </w:lvl>
+    <w:lvl w:ilvl="6" w:tentative="1">
+      <w:start w:val="1"/>
+      <w:numFmt w:val="bullet"/>
+      <w:lvlText w:val=""/>
+      <w:lvlJc w:val="left"/>
+      <w:pPr>
+        <w:tabs>
+          <w:tab w:val="num" w:pos="5040"/>
+        </w:tabs>
+        <w:ind w:left="5040" w:hanging="360"/>
+      </w:pPr>
+      <w:rPr>
+        <w:rFonts w:ascii="Symbol" w:hAnsi="Symbol" w:hint="default"/>
+        <w:sz w:val="20"/>
+      </w:rPr>
+    </w:lvl>
+    <w:lvl w:ilvl="7" w:tentative="1">
+      <w:start w:val="1"/>
+      <w:numFmt w:val="bullet"/>
+      <w:lvlText w:val=""/>
+      <w:lvlJc w:val="left"/>
+      <w:pPr>
+        <w:tabs>
+          <w:tab w:val="num" w:pos="5760"/>
+        </w:tabs>
+        <w:ind w:left="5760" w:hanging="360"/>
+      </w:pPr>
+      <w:rPr>
+        <w:rFonts w:ascii="Symbol" w:hAnsi="Symbol" w:hint="default"/>
+        <w:sz w:val="20"/>
+      </w:rPr>
+    </w:lvl>
+    <w:lvl w:ilvl="8" w:tentative="1">
+      <w:start w:val="1"/>
+      <w:numFmt w:val="bullet"/>
+      <w:lvlText w:val=""/>
+      <w:lvlJc w:val="left"/>
+      <w:pPr>
+        <w:tabs>
+          <w:tab w:val="num" w:pos="6480"/>
+        </w:tabs>
+        <w:ind w:left="6480" w:hanging="360"/>
+      </w:pPr>
+      <w:rPr>
+        <w:rFonts w:ascii="Symbol" w:hAnsi="Symbol" w:hint="default"/>
+        <w:sz w:val="20"/>
+      </w:rPr>
+    </w:lvl>
+  </w:abstractNum>
+  <w:abstractNum w:abstractNumId="39" w15:restartNumberingAfterBreak="0">
     <w:nsid w:val="61C057D1"/>
     <w:multiLevelType w:val="multilevel"/>
     <w:tmpl w:val="5708365E"/>
@@ -7877,7 +9676,156 @@
       </w:rPr>
     </w:lvl>
   </w:abstractNum>
-  <w:abstractNum w:abstractNumId="31" w15:restartNumberingAfterBreak="0">
+  <w:abstractNum w:abstractNumId="40" w15:restartNumberingAfterBreak="0">
+    <w:nsid w:val="65D43A3C"/>
+    <w:multiLevelType w:val="multilevel"/>
+    <w:tmpl w:val="8298779E"/>
+    <w:lvl w:ilvl="0">
+      <w:start w:val="1"/>
+      <w:numFmt w:val="bullet"/>
+      <w:lvlText w:val=""/>
+      <w:lvlJc w:val="left"/>
+      <w:pPr>
+        <w:tabs>
+          <w:tab w:val="num" w:pos="720"/>
+        </w:tabs>
+        <w:ind w:left="720" w:hanging="360"/>
+      </w:pPr>
+      <w:rPr>
+        <w:rFonts w:ascii="Symbol" w:hAnsi="Symbol" w:hint="default"/>
+        <w:sz w:val="20"/>
+      </w:rPr>
+    </w:lvl>
+    <w:lvl w:ilvl="1" w:tentative="1">
+      <w:start w:val="1"/>
+      <w:numFmt w:val="bullet"/>
+      <w:lvlText w:val=""/>
+      <w:lvlJc w:val="left"/>
+      <w:pPr>
+        <w:tabs>
+          <w:tab w:val="num" w:pos="1440"/>
+        </w:tabs>
+        <w:ind w:left="1440" w:hanging="360"/>
+      </w:pPr>
+      <w:rPr>
+        <w:rFonts w:ascii="Symbol" w:hAnsi="Symbol" w:hint="default"/>
+        <w:sz w:val="20"/>
+      </w:rPr>
+    </w:lvl>
+    <w:lvl w:ilvl="2" w:tentative="1">
+      <w:start w:val="1"/>
+      <w:numFmt w:val="bullet"/>
+      <w:lvlText w:val=""/>
+      <w:lvlJc w:val="left"/>
+      <w:pPr>
+        <w:tabs>
+          <w:tab w:val="num" w:pos="2160"/>
+        </w:tabs>
+        <w:ind w:left="2160" w:hanging="360"/>
+      </w:pPr>
+      <w:rPr>
+        <w:rFonts w:ascii="Symbol" w:hAnsi="Symbol" w:hint="default"/>
+        <w:sz w:val="20"/>
+      </w:rPr>
+    </w:lvl>
+    <w:lvl w:ilvl="3" w:tentative="1">
+      <w:start w:val="1"/>
+      <w:numFmt w:val="bullet"/>
+      <w:lvlText w:val=""/>
+      <w:lvlJc w:val="left"/>
+      <w:pPr>
+        <w:tabs>
+          <w:tab w:val="num" w:pos="2880"/>
+        </w:tabs>
+        <w:ind w:left="2880" w:hanging="360"/>
+      </w:pPr>
+      <w:rPr>
+        <w:rFonts w:ascii="Symbol" w:hAnsi="Symbol" w:hint="default"/>
+        <w:sz w:val="20"/>
+      </w:rPr>
+    </w:lvl>
+    <w:lvl w:ilvl="4" w:tentative="1">
+      <w:start w:val="1"/>
+      <w:numFmt w:val="bullet"/>
+      <w:lvlText w:val=""/>
+      <w:lvlJc w:val="left"/>
+      <w:pPr>
+        <w:tabs>
+          <w:tab w:val="num" w:pos="3600"/>
+        </w:tabs>
+        <w:ind w:left="3600" w:hanging="360"/>
+      </w:pPr>
+      <w:rPr>
+        <w:rFonts w:ascii="Symbol" w:hAnsi="Symbol" w:hint="default"/>
+        <w:sz w:val="20"/>
+      </w:rPr>
+    </w:lvl>
+    <w:lvl w:ilvl="5" w:tentative="1">
+      <w:start w:val="1"/>
+      <w:numFmt w:val="bullet"/>
+      <w:lvlText w:val=""/>
+      <w:lvlJc w:val="left"/>
+      <w:pPr>
+        <w:tabs>
+          <w:tab w:val="num" w:pos="4320"/>
+        </w:tabs>
+        <w:ind w:left="4320" w:hanging="360"/>
+      </w:pPr>
+      <w:rPr>
+        <w:rFonts w:ascii="Symbol" w:hAnsi="Symbol" w:hint="default"/>
+        <w:sz w:val="20"/>
+      </w:rPr>
+    </w:lvl>
+    <w:lvl w:ilvl="6" w:tentative="1">
+      <w:start w:val="1"/>
+      <w:numFmt w:val="bullet"/>
+      <w:lvlText w:val=""/>
+      <w:lvlJc w:val="left"/>
+      <w:pPr>
+        <w:tabs>
+          <w:tab w:val="num" w:pos="5040"/>
+        </w:tabs>
+        <w:ind w:left="5040" w:hanging="360"/>
+      </w:pPr>
+      <w:rPr>
+        <w:rFonts w:ascii="Symbol" w:hAnsi="Symbol" w:hint="default"/>
+        <w:sz w:val="20"/>
+      </w:rPr>
+    </w:lvl>
+    <w:lvl w:ilvl="7" w:tentative="1">
+      <w:start w:val="1"/>
+      <w:numFmt w:val="bullet"/>
+      <w:lvlText w:val=""/>
+      <w:lvlJc w:val="left"/>
+      <w:pPr>
+        <w:tabs>
+          <w:tab w:val="num" w:pos="5760"/>
+        </w:tabs>
+        <w:ind w:left="5760" w:hanging="360"/>
+      </w:pPr>
+      <w:rPr>
+        <w:rFonts w:ascii="Symbol" w:hAnsi="Symbol" w:hint="default"/>
+        <w:sz w:val="20"/>
+      </w:rPr>
+    </w:lvl>
+    <w:lvl w:ilvl="8" w:tentative="1">
+      <w:start w:val="1"/>
+      <w:numFmt w:val="bullet"/>
+      <w:lvlText w:val=""/>
+      <w:lvlJc w:val="left"/>
+      <w:pPr>
+        <w:tabs>
+          <w:tab w:val="num" w:pos="6480"/>
+        </w:tabs>
+        <w:ind w:left="6480" w:hanging="360"/>
+      </w:pPr>
+      <w:rPr>
+        <w:rFonts w:ascii="Symbol" w:hAnsi="Symbol" w:hint="default"/>
+        <w:sz w:val="20"/>
+      </w:rPr>
+    </w:lvl>
+  </w:abstractNum>
+  <w:abstractNum w:abstractNumId="41" w15:restartNumberingAfterBreak="0">
     <w:nsid w:val="65F23F0A"/>
     <w:multiLevelType w:val="multilevel"/>
     <w:tmpl w:val="69C2A034"/>
@@ -8026,7 +9974,156 @@
       </w:rPr>
     </w:lvl>
   </w:abstractNum>
-  <w:abstractNum w:abstractNumId="32" w15:restartNumberingAfterBreak="0">
+  <w:abstractNum w:abstractNumId="42" w15:restartNumberingAfterBreak="0">
+    <w:nsid w:val="68292792"/>
+    <w:multiLevelType w:val="multilevel"/>
+    <w:tmpl w:val="B284F0BE"/>
+    <w:lvl w:ilvl="0">
+      <w:start w:val="1"/>
+      <w:numFmt w:val="bullet"/>
+      <w:lvlText w:val=""/>
+      <w:lvlJc w:val="left"/>
+      <w:pPr>
+        <w:tabs>
+          <w:tab w:val="num" w:pos="720"/>
+        </w:tabs>
+        <w:ind w:left="720" w:hanging="360"/>
+      </w:pPr>
+      <w:rPr>
+        <w:rFonts w:ascii="Symbol" w:hAnsi="Symbol" w:hint="default"/>
+        <w:sz w:val="20"/>
+      </w:rPr>
+    </w:lvl>
+    <w:lvl w:ilvl="1" w:tentative="1">
+      <w:start w:val="1"/>
+      <w:numFmt w:val="bullet"/>
+      <w:lvlText w:val=""/>
+      <w:lvlJc w:val="left"/>
+      <w:pPr>
+        <w:tabs>
+          <w:tab w:val="num" w:pos="1440"/>
+        </w:tabs>
+        <w:ind w:left="1440" w:hanging="360"/>
+      </w:pPr>
+      <w:rPr>
+        <w:rFonts w:ascii="Symbol" w:hAnsi="Symbol" w:hint="default"/>
+        <w:sz w:val="20"/>
+      </w:rPr>
+    </w:lvl>
+    <w:lvl w:ilvl="2" w:tentative="1">
+      <w:start w:val="1"/>
+      <w:numFmt w:val="bullet"/>
+      <w:lvlText w:val=""/>
+      <w:lvlJc w:val="left"/>
+      <w:pPr>
+        <w:tabs>
+          <w:tab w:val="num" w:pos="2160"/>
+        </w:tabs>
+        <w:ind w:left="2160" w:hanging="360"/>
+      </w:pPr>
+      <w:rPr>
+        <w:rFonts w:ascii="Symbol" w:hAnsi="Symbol" w:hint="default"/>
+        <w:sz w:val="20"/>
+      </w:rPr>
+    </w:lvl>
+    <w:lvl w:ilvl="3" w:tentative="1">
+      <w:start w:val="1"/>
+      <w:numFmt w:val="bullet"/>
+      <w:lvlText w:val=""/>
+      <w:lvlJc w:val="left"/>
+      <w:pPr>
+        <w:tabs>
+          <w:tab w:val="num" w:pos="2880"/>
+        </w:tabs>
+        <w:ind w:left="2880" w:hanging="360"/>
+      </w:pPr>
+      <w:rPr>
+        <w:rFonts w:ascii="Symbol" w:hAnsi="Symbol" w:hint="default"/>
+        <w:sz w:val="20"/>
+      </w:rPr>
+    </w:lvl>
+    <w:lvl w:ilvl="4" w:tentative="1">
+      <w:start w:val="1"/>
+      <w:numFmt w:val="bullet"/>
+      <w:lvlText w:val=""/>
+      <w:lvlJc w:val="left"/>
+      <w:pPr>
+        <w:tabs>
+          <w:tab w:val="num" w:pos="3600"/>
+        </w:tabs>
+        <w:ind w:left="3600" w:hanging="360"/>
+      </w:pPr>
+      <w:rPr>
+        <w:rFonts w:ascii="Symbol" w:hAnsi="Symbol" w:hint="default"/>
+        <w:sz w:val="20"/>
+      </w:rPr>
+    </w:lvl>
+    <w:lvl w:ilvl="5" w:tentative="1">
+      <w:start w:val="1"/>
+      <w:numFmt w:val="bullet"/>
+      <w:lvlText w:val=""/>
+      <w:lvlJc w:val="left"/>
+      <w:pPr>
+        <w:tabs>
+          <w:tab w:val="num" w:pos="4320"/>
+        </w:tabs>
+        <w:ind w:left="4320" w:hanging="360"/>
+      </w:pPr>
+      <w:rPr>
+        <w:rFonts w:ascii="Symbol" w:hAnsi="Symbol" w:hint="default"/>
+        <w:sz w:val="20"/>
+      </w:rPr>
+    </w:lvl>
+    <w:lvl w:ilvl="6" w:tentative="1">
+      <w:start w:val="1"/>
+      <w:numFmt w:val="bullet"/>
+      <w:lvlText w:val=""/>
+      <w:lvlJc w:val="left"/>
+      <w:pPr>
+        <w:tabs>
+          <w:tab w:val="num" w:pos="5040"/>
+        </w:tabs>
+        <w:ind w:left="5040" w:hanging="360"/>
+      </w:pPr>
+      <w:rPr>
+        <w:rFonts w:ascii="Symbol" w:hAnsi="Symbol" w:hint="default"/>
+        <w:sz w:val="20"/>
+      </w:rPr>
+    </w:lvl>
+    <w:lvl w:ilvl="7" w:tentative="1">
+      <w:start w:val="1"/>
+      <w:numFmt w:val="bullet"/>
+      <w:lvlText w:val=""/>
+      <w:lvlJc w:val="left"/>
+      <w:pPr>
+        <w:tabs>
+          <w:tab w:val="num" w:pos="5760"/>
+        </w:tabs>
+        <w:ind w:left="5760" w:hanging="360"/>
+      </w:pPr>
+      <w:rPr>
+        <w:rFonts w:ascii="Symbol" w:hAnsi="Symbol" w:hint="default"/>
+        <w:sz w:val="20"/>
+      </w:rPr>
+    </w:lvl>
+    <w:lvl w:ilvl="8" w:tentative="1">
+      <w:start w:val="1"/>
+      <w:numFmt w:val="bullet"/>
+      <w:lvlText w:val=""/>
+      <w:lvlJc w:val="left"/>
+      <w:pPr>
+        <w:tabs>
+          <w:tab w:val="num" w:pos="6480"/>
+        </w:tabs>
+        <w:ind w:left="6480" w:hanging="360"/>
+      </w:pPr>
+      <w:rPr>
+        <w:rFonts w:ascii="Symbol" w:hAnsi="Symbol" w:hint="default"/>
+        <w:sz w:val="20"/>
+      </w:rPr>
+    </w:lvl>
+  </w:abstractNum>
+  <w:abstractNum w:abstractNumId="43" w15:restartNumberingAfterBreak="0">
     <w:nsid w:val="6B42041C"/>
     <w:multiLevelType w:val="multilevel"/>
     <w:tmpl w:val="89FAE254"/>
@@ -8175,7 +10272,7 @@
       </w:rPr>
     </w:lvl>
   </w:abstractNum>
-  <w:abstractNum w:abstractNumId="33" w15:restartNumberingAfterBreak="0">
+  <w:abstractNum w:abstractNumId="44" w15:restartNumberingAfterBreak="0">
     <w:nsid w:val="785068CE"/>
     <w:multiLevelType w:val="multilevel"/>
     <w:tmpl w:val="E43C6D66"/>
@@ -8324,7 +10421,7 @@
       </w:rPr>
     </w:lvl>
   </w:abstractNum>
-  <w:abstractNum w:abstractNumId="34" w15:restartNumberingAfterBreak="0">
+  <w:abstractNum w:abstractNumId="45" w15:restartNumberingAfterBreak="0">
     <w:nsid w:val="7B2917D5"/>
     <w:multiLevelType w:val="multilevel"/>
     <w:tmpl w:val="FAE001D0"/>
@@ -8473,7 +10570,7 @@
       </w:rPr>
     </w:lvl>
   </w:abstractNum>
-  <w:abstractNum w:abstractNumId="35" w15:restartNumberingAfterBreak="0">
+  <w:abstractNum w:abstractNumId="46" w15:restartNumberingAfterBreak="0">
     <w:nsid w:val="7E695A28"/>
     <w:multiLevelType w:val="multilevel"/>
     <w:tmpl w:val="17A6B1D6"/>
@@ -8623,43 +10720,43 @@
     </w:lvl>
   </w:abstractNum>
   <w:num w:numId="1" w16cid:durableId="736057289">
+    <w:abstractNumId w:val="43"/>
+  </w:num>
+  <w:num w:numId="2" w16cid:durableId="984774358">
+    <w:abstractNumId w:val="44"/>
+  </w:num>
+  <w:num w:numId="3" w16cid:durableId="43800787">
+    <w:abstractNumId w:val="31"/>
+  </w:num>
+  <w:num w:numId="4" w16cid:durableId="1485968662">
     <w:abstractNumId w:val="32"/>
   </w:num>
-  <w:num w:numId="2" w16cid:durableId="984774358">
-    <w:abstractNumId w:val="33"/>
-  </w:num>
-  <w:num w:numId="3" w16cid:durableId="43800787">
-    <w:abstractNumId w:val="24"/>
-  </w:num>
-  <w:num w:numId="4" w16cid:durableId="1485968662">
-    <w:abstractNumId w:val="25"/>
-  </w:num>
   <w:num w:numId="5" w16cid:durableId="2005158026">
-    <w:abstractNumId w:val="9"/>
+    <w:abstractNumId w:val="10"/>
   </w:num>
   <w:num w:numId="6" w16cid:durableId="373235086">
     <w:abstractNumId w:val="6"/>
   </w:num>
   <w:num w:numId="7" w16cid:durableId="1979871425">
-    <w:abstractNumId w:val="10"/>
+    <w:abstractNumId w:val="11"/>
   </w:num>
   <w:num w:numId="8" w16cid:durableId="1074476125">
-    <w:abstractNumId w:val="29"/>
+    <w:abstractNumId w:val="37"/>
   </w:num>
   <w:num w:numId="9" w16cid:durableId="1155531639">
     <w:abstractNumId w:val="3"/>
   </w:num>
   <w:num w:numId="10" w16cid:durableId="792795339">
-    <w:abstractNumId w:val="12"/>
+    <w:abstractNumId w:val="13"/>
   </w:num>
   <w:num w:numId="11" w16cid:durableId="1009872923">
-    <w:abstractNumId w:val="28"/>
+    <w:abstractNumId w:val="36"/>
   </w:num>
   <w:num w:numId="12" w16cid:durableId="1396317008">
     <w:abstractNumId w:val="4"/>
   </w:num>
   <w:num w:numId="13" w16cid:durableId="2141917699">
-    <w:abstractNumId w:val="8"/>
+    <w:abstractNumId w:val="9"/>
   </w:num>
   <w:num w:numId="14" w16cid:durableId="1243297988">
     <w:abstractNumId w:val="2"/>
@@ -8668,67 +10765,100 @@
     <w:abstractNumId w:val="1"/>
   </w:num>
   <w:num w:numId="16" w16cid:durableId="681780464">
-    <w:abstractNumId w:val="14"/>
+    <w:abstractNumId w:val="18"/>
   </w:num>
   <w:num w:numId="17" w16cid:durableId="2049069025">
-    <w:abstractNumId w:val="21"/>
+    <w:abstractNumId w:val="27"/>
   </w:num>
   <w:num w:numId="18" w16cid:durableId="1691371698">
-    <w:abstractNumId w:val="22"/>
+    <w:abstractNumId w:val="28"/>
   </w:num>
   <w:num w:numId="19" w16cid:durableId="1250774320">
-    <w:abstractNumId w:val="15"/>
+    <w:abstractNumId w:val="19"/>
   </w:num>
   <w:num w:numId="20" w16cid:durableId="219484771">
-    <w:abstractNumId w:val="30"/>
+    <w:abstractNumId w:val="39"/>
   </w:num>
   <w:num w:numId="21" w16cid:durableId="258560365">
-    <w:abstractNumId w:val="13"/>
+    <w:abstractNumId w:val="16"/>
   </w:num>
   <w:num w:numId="22" w16cid:durableId="136797838">
     <w:abstractNumId w:val="0"/>
   </w:num>
   <w:num w:numId="23" w16cid:durableId="289435070">
-    <w:abstractNumId w:val="20"/>
+    <w:abstractNumId w:val="26"/>
   </w:num>
   <w:num w:numId="24" w16cid:durableId="2140761920">
-    <w:abstractNumId w:val="26"/>
+    <w:abstractNumId w:val="33"/>
   </w:num>
   <w:num w:numId="25" w16cid:durableId="228544193">
-    <w:abstractNumId w:val="23"/>
+    <w:abstractNumId w:val="30"/>
   </w:num>
   <w:num w:numId="26" w16cid:durableId="1843470879">
-    <w:abstractNumId w:val="34"/>
+    <w:abstractNumId w:val="45"/>
   </w:num>
   <w:num w:numId="27" w16cid:durableId="321129371">
     <w:abstractNumId w:val="5"/>
   </w:num>
   <w:num w:numId="28" w16cid:durableId="1103768393">
-    <w:abstractNumId w:val="31"/>
+    <w:abstractNumId w:val="41"/>
   </w:num>
   <w:num w:numId="29" w16cid:durableId="1696034974">
-    <w:abstractNumId w:val="27"/>
+    <w:abstractNumId w:val="34"/>
   </w:num>
   <w:num w:numId="30" w16cid:durableId="1772894966">
-    <w:abstractNumId w:val="16"/>
+    <w:abstractNumId w:val="20"/>
   </w:num>
   <w:num w:numId="31" w16cid:durableId="867723325">
-    <w:abstractNumId w:val="17"/>
+    <w:abstractNumId w:val="21"/>
   </w:num>
   <w:num w:numId="32" w16cid:durableId="1153326941">
-    <w:abstractNumId w:val="18"/>
+    <w:abstractNumId w:val="23"/>
   </w:num>
   <w:num w:numId="33" w16cid:durableId="552736832">
-    <w:abstractNumId w:val="19"/>
+    <w:abstractNumId w:val="25"/>
   </w:num>
   <w:num w:numId="34" w16cid:durableId="525287768">
     <w:abstractNumId w:val="7"/>
   </w:num>
   <w:num w:numId="35" w16cid:durableId="1573542307">
-    <w:abstractNumId w:val="11"/>
+    <w:abstractNumId w:val="12"/>
   </w:num>
   <w:num w:numId="36" w16cid:durableId="1856311548">
+    <w:abstractNumId w:val="46"/>
+  </w:num>
+  <w:num w:numId="37" w16cid:durableId="943609792">
+    <w:abstractNumId w:val="42"/>
+  </w:num>
+  <w:num w:numId="38" w16cid:durableId="326446066">
+    <w:abstractNumId w:val="22"/>
+  </w:num>
+  <w:num w:numId="39" w16cid:durableId="1306083012">
+    <w:abstractNumId w:val="24"/>
+  </w:num>
+  <w:num w:numId="40" w16cid:durableId="1107194611">
+    <w:abstractNumId w:val="15"/>
+  </w:num>
+  <w:num w:numId="41" w16cid:durableId="292516133">
+    <w:abstractNumId w:val="17"/>
+  </w:num>
+  <w:num w:numId="42" w16cid:durableId="897015651">
+    <w:abstractNumId w:val="40"/>
+  </w:num>
+  <w:num w:numId="43" w16cid:durableId="1330018641">
+    <w:abstractNumId w:val="14"/>
+  </w:num>
+  <w:num w:numId="44" w16cid:durableId="1719012608">
     <w:abstractNumId w:val="35"/>
+  </w:num>
+  <w:num w:numId="45" w16cid:durableId="742488319">
+    <w:abstractNumId w:val="38"/>
+  </w:num>
+  <w:num w:numId="46" w16cid:durableId="409427962">
+    <w:abstractNumId w:val="8"/>
+  </w:num>
+  <w:num w:numId="47" w16cid:durableId="1008025516">
+    <w:abstractNumId w:val="29"/>
   </w:num>
 </w:numbering>
 </file>

</xml_diff>